<commit_message>
Adiciona o arquivo da atividade formatado em abnt
</commit_message>
<xml_diff>
--- a/Atividade - sistemas embarcados - Fernando, Vinícius.docx
+++ b/Atividade - sistemas embarcados - Fernando, Vinícius.docx
@@ -1,6 +1,6 @@
 
 <file path=word/document.xml><?xml version="1.0" encoding="utf-8"?>
-<w:document xmlns:wpc="http://schemas.microsoft.com/office/word/2010/wordprocessingCanvas" xmlns:cx="http://schemas.microsoft.com/office/drawing/2014/chartex" xmlns:cx1="http://schemas.microsoft.com/office/drawing/2015/9/8/chartex" xmlns:cx2="http://schemas.microsoft.com/office/drawing/2015/10/21/chartex" xmlns:cx3="http://schemas.microsoft.com/office/drawing/2016/5/9/chartex" xmlns:cx4="http://schemas.microsoft.com/office/drawing/2016/5/10/chartex" xmlns:cx5="http://schemas.microsoft.com/office/drawing/2016/5/11/chartex" xmlns:cx6="http://schemas.microsoft.com/office/drawing/2016/5/12/chartex" xmlns:cx7="http://schemas.microsoft.com/office/drawing/2016/5/13/chartex" xmlns:cx8="http://schemas.microsoft.com/office/drawing/2016/5/14/chartex" xmlns:mc="http://schemas.openxmlformats.org/markup-compatibility/2006" xmlns:aink="http://schemas.microsoft.com/office/drawing/2016/ink" xmlns:am3d="http://schemas.microsoft.com/office/drawing/2017/model3d" xmlns:o="urn:schemas-microsoft-com:office:office" xmlns:oel="http://schemas.microsoft.com/office/2019/extlst" xmlns:r="http://schemas.openxmlformats.org/officeDocument/2006/relationships" xmlns:m="http://schemas.openxmlformats.org/officeDocument/2006/math" xmlns:v="urn:schemas-microsoft-com:vml" xmlns:wp14="http://schemas.microsoft.com/office/word/2010/wordprocessingDrawing" xmlns:wp="http://schemas.openxmlformats.org/drawingml/2006/wordprocessingDrawing" xmlns:w10="urn:schemas-microsoft-com:office:word" xmlns:w="http://schemas.openxmlformats.org/wordprocessingml/2006/main" xmlns:w14="http://schemas.microsoft.com/office/word/2010/wordml" xmlns:w15="http://schemas.microsoft.com/office/word/2012/wordml" xmlns:w16cex="http://schemas.microsoft.com/office/word/2018/wordml/cex" xmlns:w16cid="http://schemas.microsoft.com/office/word/2016/wordml/cid" xmlns:w16="http://schemas.microsoft.com/office/word/2018/wordml" xmlns:w16sdtdh="http://schemas.microsoft.com/office/word/2020/wordml/sdtdatahash" xmlns:w16se="http://schemas.microsoft.com/office/word/2015/wordml/symex" xmlns:wpg="http://schemas.microsoft.com/office/word/2010/wordprocessingGroup" xmlns:wpi="http://schemas.microsoft.com/office/word/2010/wordprocessingInk" xmlns:wne="http://schemas.microsoft.com/office/word/2006/wordml" xmlns:wps="http://schemas.microsoft.com/office/word/2010/wordprocessingShape" mc:Ignorable="w14 w15 w16se w16cid w16 w16cex w16sdtdh wp14">
+<w:document xmlns:wpc="http://schemas.microsoft.com/office/word/2010/wordprocessingCanvas" xmlns:mc="http://schemas.openxmlformats.org/markup-compatibility/2006" xmlns:o="urn:schemas-microsoft-com:office:office" xmlns:r="http://schemas.openxmlformats.org/officeDocument/2006/relationships" xmlns:m="http://schemas.openxmlformats.org/officeDocument/2006/math" xmlns:v="urn:schemas-microsoft-com:vml" xmlns:wp14="http://schemas.microsoft.com/office/word/2010/wordprocessingDrawing" xmlns:wp="http://schemas.openxmlformats.org/drawingml/2006/wordprocessingDrawing" xmlns:w10="urn:schemas-microsoft-com:office:word" xmlns:w="http://schemas.openxmlformats.org/wordprocessingml/2006/main" xmlns:w14="http://schemas.microsoft.com/office/word/2010/wordml" xmlns:wpg="http://schemas.microsoft.com/office/word/2010/wordprocessingGroup" xmlns:wpi="http://schemas.microsoft.com/office/word/2010/wordprocessingInk" xmlns:wne="http://schemas.microsoft.com/office/word/2006/wordml" xmlns:wps="http://schemas.microsoft.com/office/word/2010/wordprocessingShape" mc:Ignorable="w14 wp14">
   <w:body>
     <w:p>
       <w:pPr>
@@ -78,7 +78,15 @@
         <w:jc w:val="center"/>
       </w:pPr>
       <w:r>
-        <w:t xml:space="preserve">FERNANDO FIANI DE PINA SARAIVA </w:t>
+        <w:t>F</w:t>
+      </w:r>
+      <w:bookmarkStart w:id="0" w:name="_GoBack"/>
+      <w:bookmarkEnd w:id="0"/>
+      <w:r>
+        <w:t>ERNANDO</w:t>
+      </w:r>
+      <w:r>
+        <w:t xml:space="preserve"> FIANI DE PINA SARAIVA </w:t>
       </w:r>
     </w:p>
     <w:p>
@@ -249,6 +257,11 @@
         <w:br/>
         <w:t>2026</w:t>
       </w:r>
+    </w:p>
+    <w:p>
+      <w:pPr>
+        <w:jc w:val="center"/>
+      </w:pPr>
     </w:p>
     <w:p>
       <w:pPr>
@@ -397,7 +410,7 @@
         <w:jc w:val="center"/>
       </w:pPr>
       <w:r>
-        <w:t>Cidade</w:t>
+        <w:t>São Paulo</w:t>
       </w:r>
       <w:r>
         <w:br/>
@@ -406,13 +419,6 @@
     </w:p>
     <w:sdt>
       <w:sdtPr>
-        <w:id w:val="1479810554"/>
-        <w:docPartObj>
-          <w:docPartGallery w:val="Table of Contents"/>
-          <w:docPartUnique/>
-        </w:docPartObj>
-      </w:sdtPr>
-      <w:sdtEndPr>
         <w:rPr>
           <w:rFonts w:asciiTheme="minorHAnsi" w:eastAsiaTheme="minorHAnsi" w:hAnsiTheme="minorHAnsi" w:cstheme="minorBidi"/>
           <w:color w:val="auto"/>
@@ -422,11 +428,17 @@
           <w:lang w:eastAsia="en-US"/>
           <w14:ligatures w14:val="standardContextual"/>
         </w:rPr>
-      </w:sdtEndPr>
+        <w:id w:val="1479810554"/>
+        <w:docPartObj>
+          <w:docPartGallery w:val="Table of Contents"/>
+          <w:docPartUnique/>
+        </w:docPartObj>
+      </w:sdtPr>
+      <w:sdtEndPr/>
       <w:sdtContent>
         <w:p>
           <w:pPr>
-            <w:pStyle w:val="CabealhodoSumrio"/>
+            <w:pStyle w:val="Ttulodondice"/>
           </w:pPr>
           <w:r>
             <w:t>Sumário</w:t>
@@ -434,7 +446,7 @@
         </w:p>
         <w:p>
           <w:pPr>
-            <w:pStyle w:val="Sumrio1"/>
+            <w:pStyle w:val="ndice1"/>
           </w:pPr>
           <w:r>
             <w:rPr>
@@ -463,7 +475,7 @@
         </w:p>
         <w:p>
           <w:pPr>
-            <w:pStyle w:val="Sumrio2"/>
+            <w:pStyle w:val="ndice2"/>
             <w:ind w:left="216"/>
           </w:pPr>
           <w:r>
@@ -482,7 +494,7 @@
         </w:p>
         <w:p>
           <w:pPr>
-            <w:pStyle w:val="Sumrio3"/>
+            <w:pStyle w:val="ndice3"/>
             <w:ind w:left="446"/>
           </w:pPr>
           <w:r>
@@ -588,7 +600,7 @@
         </w:p>
         <w:p>
           <w:pPr>
-            <w:pStyle w:val="Sumrio1"/>
+            <w:pStyle w:val="ndice1"/>
           </w:pPr>
           <w:r>
             <w:rPr>
@@ -610,7 +622,7 @@
         </w:p>
         <w:p>
           <w:pPr>
-            <w:pStyle w:val="Sumrio2"/>
+            <w:pStyle w:val="ndice2"/>
             <w:ind w:left="216"/>
           </w:pPr>
           <w:r>
@@ -809,7 +821,7 @@
         </w:p>
         <w:p>
           <w:pPr>
-            <w:pStyle w:val="Sumrio1"/>
+            <w:pStyle w:val="ndice1"/>
           </w:pPr>
           <w:r>
             <w:rPr>
@@ -873,7 +885,6 @@
           <w:b/>
           <w:bCs/>
         </w:rPr>
-        <w:lastRenderedPageBreak/>
         <w:t>1 COMPONENTES DE SISTEMAS EMBARCADOS</w:t>
       </w:r>
     </w:p>
@@ -1197,7 +1208,6 @@
       <w:pPr>
         <w:jc w:val="both"/>
       </w:pPr>
-      <w:proofErr w:type="spellStart"/>
       <w:r>
         <w:rPr>
           <w:b/>
@@ -1205,7 +1215,6 @@
         </w:rPr>
         <w:t>Buzzer</w:t>
       </w:r>
-      <w:proofErr w:type="spellEnd"/>
       <w:r>
         <w:br/>
         <w:t>Dispositivo que emite som quando recebe energia elétrica.</w:t>
@@ -1265,23 +1274,7 @@
           <w:b/>
           <w:bCs/>
         </w:rPr>
-        <w:t xml:space="preserve">RAM (Random Access </w:t>
-      </w:r>
-      <w:proofErr w:type="spellStart"/>
-      <w:r>
-        <w:rPr>
-          <w:b/>
-          <w:bCs/>
-        </w:rPr>
-        <w:t>Memory</w:t>
-      </w:r>
-      <w:proofErr w:type="spellEnd"/>
-      <w:r>
-        <w:rPr>
-          <w:b/>
-          <w:bCs/>
-        </w:rPr>
-        <w:t>)</w:t>
+        <w:t>RAM (Random Access Memory)</w:t>
       </w:r>
       <w:r>
         <w:br/>
@@ -1294,39 +1287,7 @@
           <w:b/>
           <w:bCs/>
         </w:rPr>
-        <w:t>ROM (</w:t>
-      </w:r>
-      <w:proofErr w:type="spellStart"/>
-      <w:r>
-        <w:rPr>
-          <w:b/>
-          <w:bCs/>
-        </w:rPr>
-        <w:t>Read</w:t>
-      </w:r>
-      <w:proofErr w:type="spellEnd"/>
-      <w:r>
-        <w:rPr>
-          <w:b/>
-          <w:bCs/>
-        </w:rPr>
-        <w:t xml:space="preserve"> Only </w:t>
-      </w:r>
-      <w:proofErr w:type="spellStart"/>
-      <w:r>
-        <w:rPr>
-          <w:b/>
-          <w:bCs/>
-        </w:rPr>
-        <w:t>Memory</w:t>
-      </w:r>
-      <w:proofErr w:type="spellEnd"/>
-      <w:r>
-        <w:rPr>
-          <w:b/>
-          <w:bCs/>
-        </w:rPr>
-        <w:t>)</w:t>
+        <w:t>ROM (Read Only Memory)</w:t>
       </w:r>
       <w:r>
         <w:br/>
@@ -1434,23 +1395,7 @@
           <w:b/>
           <w:bCs/>
         </w:rPr>
-        <w:t>I2C (</w:t>
-      </w:r>
-      <w:proofErr w:type="spellStart"/>
-      <w:r>
-        <w:rPr>
-          <w:b/>
-          <w:bCs/>
-        </w:rPr>
-        <w:t>Inter-Integrated</w:t>
-      </w:r>
-      <w:proofErr w:type="spellEnd"/>
-      <w:r>
-        <w:rPr>
-          <w:b/>
-          <w:bCs/>
-        </w:rPr>
-        <w:t xml:space="preserve"> Circuit)</w:t>
+        <w:t>I2C (Inter-Integrated Circuit)</w:t>
       </w:r>
       <w:r>
         <w:br/>
@@ -1463,17 +1408,8 @@
           <w:b/>
           <w:bCs/>
         </w:rPr>
-        <w:t xml:space="preserve">SPI (Serial </w:t>
-      </w:r>
-      <w:proofErr w:type="spellStart"/>
-      <w:r>
-        <w:rPr>
-          <w:b/>
-          <w:bCs/>
-        </w:rPr>
-        <w:t>Peripheral</w:t>
-      </w:r>
-      <w:proofErr w:type="spellEnd"/>
+        <w:t>SPI (Serial Peripheral</w:t>
+      </w:r>
       <w:r>
         <w:rPr>
           <w:b/>
@@ -1499,56 +1435,7 @@
           <w:b/>
           <w:bCs/>
         </w:rPr>
-        <w:lastRenderedPageBreak/>
-        <w:t xml:space="preserve">UART (Universal </w:t>
-      </w:r>
-      <w:proofErr w:type="spellStart"/>
-      <w:r>
-        <w:rPr>
-          <w:b/>
-          <w:bCs/>
-        </w:rPr>
-        <w:t>Asynchronous</w:t>
-      </w:r>
-      <w:proofErr w:type="spellEnd"/>
-      <w:r>
-        <w:rPr>
-          <w:b/>
-          <w:bCs/>
-        </w:rPr>
-        <w:t xml:space="preserve"> </w:t>
-      </w:r>
-      <w:proofErr w:type="spellStart"/>
-      <w:r>
-        <w:rPr>
-          <w:b/>
-          <w:bCs/>
-        </w:rPr>
-        <w:t>Receiver</w:t>
-      </w:r>
-      <w:proofErr w:type="spellEnd"/>
-      <w:r>
-        <w:rPr>
-          <w:b/>
-          <w:bCs/>
-        </w:rPr>
-        <w:t xml:space="preserve"> </w:t>
-      </w:r>
-      <w:proofErr w:type="spellStart"/>
-      <w:r>
-        <w:rPr>
-          <w:b/>
-          <w:bCs/>
-        </w:rPr>
-        <w:t>Transmitter</w:t>
-      </w:r>
-      <w:proofErr w:type="spellEnd"/>
-      <w:r>
-        <w:rPr>
-          <w:b/>
-          <w:bCs/>
-        </w:rPr>
-        <w:t>)</w:t>
+        <w:t>UART (Universal Asynchronous Receiver Transmitter)</w:t>
       </w:r>
       <w:r>
         <w:br/>
@@ -1869,24 +1756,29 @@
         <w:jc w:val="both"/>
       </w:pPr>
       <w:r>
-        <w:lastRenderedPageBreak/>
         <w:t>Onde:</w:t>
       </w:r>
       <w:r>
         <w:br/>
-        <w:t>P=</w:t>
       </w:r>
       <w:proofErr w:type="gramStart"/>
       <w:r>
-        <w:t>Potência(</w:t>
+        <w:t>P=Potência(Watts</w:t>
       </w:r>
       <w:proofErr w:type="gramEnd"/>
       <w:r>
-        <w:t>Watts)</w:t>
+        <w:t>)</w:t>
       </w:r>
       <w:r>
         <w:br/>
-        <w:t>V=Tensão(Volts)</w:t>
+      </w:r>
+      <w:proofErr w:type="gramStart"/>
+      <w:r>
+        <w:t>V=Tensão(Volts</w:t>
+      </w:r>
+      <w:proofErr w:type="gramEnd"/>
+      <w:r>
+        <w:t>)</w:t>
       </w:r>
       <w:r>
         <w:br/>
@@ -1911,6 +1803,7 @@
           <w:b/>
           <w:bCs/>
         </w:rPr>
+        <w:lastRenderedPageBreak/>
         <w:t>2.5 Lei de Ohm</w:t>
       </w:r>
     </w:p>
@@ -2026,10 +1919,10 @@
       <w:r>
         <w:t xml:space="preserve">ARDUINO. Documentação oficial. Disponível em: </w:t>
       </w:r>
-      <w:hyperlink r:id="rId5" w:history="1">
+      <w:hyperlink r:id="rId6" w:history="1">
         <w:r>
           <w:rPr>
-            <w:rStyle w:val="Hyperlink"/>
+            <w:rStyle w:val="Hiperligao"/>
           </w:rPr>
           <w:t>https://www.arduino.cc</w:t>
         </w:r>
@@ -2050,7 +1943,7 @@
 </file>
 
 <file path=word/styles.xml><?xml version="1.0" encoding="utf-8"?>
-<w:styles xmlns:mc="http://schemas.openxmlformats.org/markup-compatibility/2006" xmlns:r="http://schemas.openxmlformats.org/officeDocument/2006/relationships" xmlns:w="http://schemas.openxmlformats.org/wordprocessingml/2006/main" xmlns:w14="http://schemas.microsoft.com/office/word/2010/wordml" xmlns:w15="http://schemas.microsoft.com/office/word/2012/wordml" xmlns:w16cex="http://schemas.microsoft.com/office/word/2018/wordml/cex" xmlns:w16cid="http://schemas.microsoft.com/office/word/2016/wordml/cid" xmlns:w16="http://schemas.microsoft.com/office/word/2018/wordml" xmlns:w16sdtdh="http://schemas.microsoft.com/office/word/2020/wordml/sdtdatahash" xmlns:w16se="http://schemas.microsoft.com/office/word/2015/wordml/symex" mc:Ignorable="w14 w15 w16se w16cid w16 w16cex w16sdtdh">
+<w:styles xmlns:mc="http://schemas.openxmlformats.org/markup-compatibility/2006" xmlns:r="http://schemas.openxmlformats.org/officeDocument/2006/relationships" xmlns:w="http://schemas.openxmlformats.org/wordprocessingml/2006/main" xmlns:w14="http://schemas.microsoft.com/office/word/2010/wordml" mc:Ignorable="w14">
   <w:docDefaults>
     <w:rPrDefault>
       <w:rPr>
@@ -2068,393 +1961,154 @@
       </w:pPr>
     </w:pPrDefault>
   </w:docDefaults>
-  <w:latentStyles w:defLockedState="0" w:defUIPriority="99" w:defSemiHidden="0" w:defUnhideWhenUsed="0" w:defQFormat="0" w:count="376">
-    <w:lsdException w:name="Normal" w:uiPriority="0" w:qFormat="1"/>
-    <w:lsdException w:name="heading 1" w:uiPriority="9" w:qFormat="1"/>
-    <w:lsdException w:name="heading 2" w:semiHidden="1" w:uiPriority="9" w:unhideWhenUsed="1" w:qFormat="1"/>
-    <w:lsdException w:name="heading 3" w:semiHidden="1" w:uiPriority="9" w:unhideWhenUsed="1" w:qFormat="1"/>
-    <w:lsdException w:name="heading 4" w:semiHidden="1" w:uiPriority="9" w:unhideWhenUsed="1" w:qFormat="1"/>
-    <w:lsdException w:name="heading 5" w:semiHidden="1" w:uiPriority="9" w:unhideWhenUsed="1" w:qFormat="1"/>
-    <w:lsdException w:name="heading 6" w:semiHidden="1" w:uiPriority="9" w:unhideWhenUsed="1" w:qFormat="1"/>
-    <w:lsdException w:name="heading 7" w:semiHidden="1" w:uiPriority="9" w:unhideWhenUsed="1" w:qFormat="1"/>
-    <w:lsdException w:name="heading 8" w:semiHidden="1" w:uiPriority="9" w:unhideWhenUsed="1" w:qFormat="1"/>
-    <w:lsdException w:name="heading 9" w:semiHidden="1" w:uiPriority="9" w:unhideWhenUsed="1" w:qFormat="1"/>
-    <w:lsdException w:name="index 1" w:semiHidden="1" w:unhideWhenUsed="1"/>
-    <w:lsdException w:name="index 2" w:semiHidden="1" w:unhideWhenUsed="1"/>
-    <w:lsdException w:name="index 3" w:semiHidden="1" w:unhideWhenUsed="1"/>
-    <w:lsdException w:name="index 4" w:semiHidden="1" w:unhideWhenUsed="1"/>
-    <w:lsdException w:name="index 5" w:semiHidden="1" w:unhideWhenUsed="1"/>
-    <w:lsdException w:name="index 6" w:semiHidden="1" w:unhideWhenUsed="1"/>
-    <w:lsdException w:name="index 7" w:semiHidden="1" w:unhideWhenUsed="1"/>
-    <w:lsdException w:name="index 8" w:semiHidden="1" w:unhideWhenUsed="1"/>
-    <w:lsdException w:name="index 9" w:semiHidden="1" w:unhideWhenUsed="1"/>
-    <w:lsdException w:name="toc 1" w:semiHidden="1" w:uiPriority="39" w:unhideWhenUsed="1"/>
-    <w:lsdException w:name="toc 2" w:semiHidden="1" w:uiPriority="39" w:unhideWhenUsed="1"/>
-    <w:lsdException w:name="toc 3" w:semiHidden="1" w:uiPriority="39" w:unhideWhenUsed="1"/>
-    <w:lsdException w:name="toc 4" w:semiHidden="1" w:uiPriority="39" w:unhideWhenUsed="1"/>
-    <w:lsdException w:name="toc 5" w:semiHidden="1" w:uiPriority="39" w:unhideWhenUsed="1"/>
-    <w:lsdException w:name="toc 6" w:semiHidden="1" w:uiPriority="39" w:unhideWhenUsed="1"/>
-    <w:lsdException w:name="toc 7" w:semiHidden="1" w:uiPriority="39" w:unhideWhenUsed="1"/>
-    <w:lsdException w:name="toc 8" w:semiHidden="1" w:uiPriority="39" w:unhideWhenUsed="1"/>
-    <w:lsdException w:name="toc 9" w:semiHidden="1" w:uiPriority="39" w:unhideWhenUsed="1"/>
-    <w:lsdException w:name="Normal Indent" w:semiHidden="1" w:unhideWhenUsed="1"/>
-    <w:lsdException w:name="footnote text" w:semiHidden="1" w:unhideWhenUsed="1"/>
-    <w:lsdException w:name="annotation text" w:semiHidden="1" w:unhideWhenUsed="1"/>
-    <w:lsdException w:name="header" w:semiHidden="1" w:unhideWhenUsed="1"/>
-    <w:lsdException w:name="footer" w:semiHidden="1" w:unhideWhenUsed="1"/>
-    <w:lsdException w:name="index heading" w:semiHidden="1" w:unhideWhenUsed="1"/>
-    <w:lsdException w:name="caption" w:semiHidden="1" w:uiPriority="35" w:unhideWhenUsed="1" w:qFormat="1"/>
-    <w:lsdException w:name="table of figures" w:semiHidden="1" w:unhideWhenUsed="1"/>
-    <w:lsdException w:name="envelope address" w:semiHidden="1" w:unhideWhenUsed="1"/>
-    <w:lsdException w:name="envelope return" w:semiHidden="1" w:unhideWhenUsed="1"/>
-    <w:lsdException w:name="footnote reference" w:semiHidden="1" w:unhideWhenUsed="1"/>
-    <w:lsdException w:name="annotation reference" w:semiHidden="1" w:unhideWhenUsed="1"/>
-    <w:lsdException w:name="line number" w:semiHidden="1" w:unhideWhenUsed="1"/>
-    <w:lsdException w:name="page number" w:semiHidden="1" w:unhideWhenUsed="1"/>
-    <w:lsdException w:name="endnote reference" w:semiHidden="1" w:unhideWhenUsed="1"/>
-    <w:lsdException w:name="endnote text" w:semiHidden="1" w:unhideWhenUsed="1"/>
-    <w:lsdException w:name="table of authorities" w:semiHidden="1" w:unhideWhenUsed="1"/>
-    <w:lsdException w:name="macro" w:semiHidden="1" w:unhideWhenUsed="1"/>
-    <w:lsdException w:name="toa heading" w:semiHidden="1" w:unhideWhenUsed="1"/>
-    <w:lsdException w:name="List" w:semiHidden="1" w:unhideWhenUsed="1"/>
-    <w:lsdException w:name="List Bullet" w:semiHidden="1" w:unhideWhenUsed="1"/>
-    <w:lsdException w:name="List Number" w:semiHidden="1" w:unhideWhenUsed="1"/>
-    <w:lsdException w:name="List 2" w:semiHidden="1" w:unhideWhenUsed="1"/>
-    <w:lsdException w:name="List 3" w:semiHidden="1" w:unhideWhenUsed="1"/>
-    <w:lsdException w:name="List 4" w:semiHidden="1" w:unhideWhenUsed="1"/>
-    <w:lsdException w:name="List 5" w:semiHidden="1" w:unhideWhenUsed="1"/>
-    <w:lsdException w:name="List Bullet 2" w:semiHidden="1" w:unhideWhenUsed="1"/>
-    <w:lsdException w:name="List Bullet 3" w:semiHidden="1" w:unhideWhenUsed="1"/>
-    <w:lsdException w:name="List Bullet 4" w:semiHidden="1" w:unhideWhenUsed="1"/>
-    <w:lsdException w:name="List Bullet 5" w:semiHidden="1" w:unhideWhenUsed="1"/>
-    <w:lsdException w:name="List Number 2" w:semiHidden="1" w:unhideWhenUsed="1"/>
-    <w:lsdException w:name="List Number 3" w:semiHidden="1" w:unhideWhenUsed="1"/>
-    <w:lsdException w:name="List Number 4" w:semiHidden="1" w:unhideWhenUsed="1"/>
-    <w:lsdException w:name="List Number 5" w:semiHidden="1" w:unhideWhenUsed="1"/>
-    <w:lsdException w:name="Title" w:uiPriority="10" w:qFormat="1"/>
-    <w:lsdException w:name="Closing" w:semiHidden="1" w:unhideWhenUsed="1"/>
-    <w:lsdException w:name="Signature" w:semiHidden="1" w:unhideWhenUsed="1"/>
-    <w:lsdException w:name="Default Paragraph Font" w:semiHidden="1" w:uiPriority="1" w:unhideWhenUsed="1"/>
-    <w:lsdException w:name="Body Text" w:semiHidden="1" w:unhideWhenUsed="1"/>
-    <w:lsdException w:name="Body Text Indent" w:semiHidden="1" w:unhideWhenUsed="1"/>
-    <w:lsdException w:name="List Continue" w:semiHidden="1" w:unhideWhenUsed="1"/>
-    <w:lsdException w:name="List Continue 2" w:semiHidden="1" w:unhideWhenUsed="1"/>
-    <w:lsdException w:name="List Continue 3" w:semiHidden="1" w:unhideWhenUsed="1"/>
-    <w:lsdException w:name="List Continue 4" w:semiHidden="1" w:unhideWhenUsed="1"/>
-    <w:lsdException w:name="List Continue 5" w:semiHidden="1" w:unhideWhenUsed="1"/>
-    <w:lsdException w:name="Message Header" w:semiHidden="1" w:unhideWhenUsed="1"/>
-    <w:lsdException w:name="Subtitle" w:uiPriority="11" w:qFormat="1"/>
-    <w:lsdException w:name="Salutation" w:semiHidden="1" w:unhideWhenUsed="1"/>
-    <w:lsdException w:name="Date" w:semiHidden="1" w:unhideWhenUsed="1"/>
-    <w:lsdException w:name="Body Text First Indent" w:semiHidden="1" w:unhideWhenUsed="1"/>
-    <w:lsdException w:name="Body Text First Indent 2" w:semiHidden="1" w:unhideWhenUsed="1"/>
-    <w:lsdException w:name="Note Heading" w:semiHidden="1" w:unhideWhenUsed="1"/>
-    <w:lsdException w:name="Body Text 2" w:semiHidden="1" w:unhideWhenUsed="1"/>
-    <w:lsdException w:name="Body Text 3" w:semiHidden="1" w:unhideWhenUsed="1"/>
-    <w:lsdException w:name="Body Text Indent 2" w:semiHidden="1" w:unhideWhenUsed="1"/>
-    <w:lsdException w:name="Body Text Indent 3" w:semiHidden="1" w:unhideWhenUsed="1"/>
-    <w:lsdException w:name="Block Text" w:semiHidden="1" w:unhideWhenUsed="1"/>
-    <w:lsdException w:name="Hyperlink" w:semiHidden="1" w:unhideWhenUsed="1"/>
-    <w:lsdException w:name="FollowedHyperlink" w:semiHidden="1" w:unhideWhenUsed="1"/>
-    <w:lsdException w:name="Strong" w:uiPriority="22" w:qFormat="1"/>
-    <w:lsdException w:name="Emphasis" w:uiPriority="20" w:qFormat="1"/>
-    <w:lsdException w:name="Document Map" w:semiHidden="1" w:unhideWhenUsed="1"/>
-    <w:lsdException w:name="Plain Text" w:semiHidden="1" w:unhideWhenUsed="1"/>
-    <w:lsdException w:name="E-mail Signature" w:semiHidden="1" w:unhideWhenUsed="1"/>
-    <w:lsdException w:name="HTML Top of Form" w:semiHidden="1" w:unhideWhenUsed="1"/>
-    <w:lsdException w:name="HTML Bottom of Form" w:semiHidden="1" w:unhideWhenUsed="1"/>
-    <w:lsdException w:name="Normal (Web)" w:semiHidden="1" w:unhideWhenUsed="1"/>
-    <w:lsdException w:name="HTML Acronym" w:semiHidden="1" w:unhideWhenUsed="1"/>
-    <w:lsdException w:name="HTML Address" w:semiHidden="1" w:unhideWhenUsed="1"/>
-    <w:lsdException w:name="HTML Cite" w:semiHidden="1" w:unhideWhenUsed="1"/>
-    <w:lsdException w:name="HTML Code" w:semiHidden="1" w:unhideWhenUsed="1"/>
-    <w:lsdException w:name="HTML Definition" w:semiHidden="1" w:unhideWhenUsed="1"/>
-    <w:lsdException w:name="HTML Keyboard" w:semiHidden="1" w:unhideWhenUsed="1"/>
-    <w:lsdException w:name="HTML Preformatted" w:semiHidden="1" w:unhideWhenUsed="1"/>
-    <w:lsdException w:name="HTML Sample" w:semiHidden="1" w:unhideWhenUsed="1"/>
-    <w:lsdException w:name="HTML Typewriter" w:semiHidden="1" w:unhideWhenUsed="1"/>
-    <w:lsdException w:name="HTML Variable" w:semiHidden="1" w:unhideWhenUsed="1"/>
-    <w:lsdException w:name="Normal Table" w:semiHidden="1" w:unhideWhenUsed="1"/>
-    <w:lsdException w:name="annotation subject" w:semiHidden="1" w:unhideWhenUsed="1"/>
-    <w:lsdException w:name="No List" w:semiHidden="1" w:unhideWhenUsed="1"/>
-    <w:lsdException w:name="Outline List 1" w:semiHidden="1" w:unhideWhenUsed="1"/>
-    <w:lsdException w:name="Outline List 2" w:semiHidden="1" w:unhideWhenUsed="1"/>
-    <w:lsdException w:name="Outline List 3" w:semiHidden="1" w:unhideWhenUsed="1"/>
-    <w:lsdException w:name="Table Simple 1" w:semiHidden="1" w:unhideWhenUsed="1"/>
-    <w:lsdException w:name="Table Simple 2" w:semiHidden="1" w:unhideWhenUsed="1"/>
-    <w:lsdException w:name="Table Simple 3" w:semiHidden="1" w:unhideWhenUsed="1"/>
-    <w:lsdException w:name="Table Classic 1" w:semiHidden="1" w:unhideWhenUsed="1"/>
-    <w:lsdException w:name="Table Classic 2" w:semiHidden="1" w:unhideWhenUsed="1"/>
-    <w:lsdException w:name="Table Classic 3" w:semiHidden="1" w:unhideWhenUsed="1"/>
-    <w:lsdException w:name="Table Classic 4" w:semiHidden="1" w:unhideWhenUsed="1"/>
-    <w:lsdException w:name="Table Colorful 1" w:semiHidden="1" w:unhideWhenUsed="1"/>
-    <w:lsdException w:name="Table Colorful 2" w:semiHidden="1" w:unhideWhenUsed="1"/>
-    <w:lsdException w:name="Table Colorful 3" w:semiHidden="1" w:unhideWhenUsed="1"/>
-    <w:lsdException w:name="Table Columns 1" w:semiHidden="1" w:unhideWhenUsed="1"/>
-    <w:lsdException w:name="Table Columns 2" w:semiHidden="1" w:unhideWhenUsed="1"/>
-    <w:lsdException w:name="Table Columns 3" w:semiHidden="1" w:unhideWhenUsed="1"/>
-    <w:lsdException w:name="Table Columns 4" w:semiHidden="1" w:unhideWhenUsed="1"/>
-    <w:lsdException w:name="Table Columns 5" w:semiHidden="1" w:unhideWhenUsed="1"/>
-    <w:lsdException w:name="Table Grid 1" w:semiHidden="1" w:unhideWhenUsed="1"/>
-    <w:lsdException w:name="Table Grid 2" w:semiHidden="1" w:unhideWhenUsed="1"/>
-    <w:lsdException w:name="Table Grid 3" w:semiHidden="1" w:unhideWhenUsed="1"/>
-    <w:lsdException w:name="Table Grid 4" w:semiHidden="1" w:unhideWhenUsed="1"/>
-    <w:lsdException w:name="Table Grid 5" w:semiHidden="1" w:unhideWhenUsed="1"/>
-    <w:lsdException w:name="Table Grid 6" w:semiHidden="1" w:unhideWhenUsed="1"/>
-    <w:lsdException w:name="Table Grid 7" w:semiHidden="1" w:unhideWhenUsed="1"/>
-    <w:lsdException w:name="Table Grid 8" w:semiHidden="1" w:unhideWhenUsed="1"/>
-    <w:lsdException w:name="Table List 1" w:semiHidden="1" w:unhideWhenUsed="1"/>
-    <w:lsdException w:name="Table List 2" w:semiHidden="1" w:unhideWhenUsed="1"/>
-    <w:lsdException w:name="Table List 3" w:semiHidden="1" w:unhideWhenUsed="1"/>
-    <w:lsdException w:name="Table List 4" w:semiHidden="1" w:unhideWhenUsed="1"/>
-    <w:lsdException w:name="Table List 5" w:semiHidden="1" w:unhideWhenUsed="1"/>
-    <w:lsdException w:name="Table List 6" w:semiHidden="1" w:unhideWhenUsed="1"/>
-    <w:lsdException w:name="Table List 7" w:semiHidden="1" w:unhideWhenUsed="1"/>
-    <w:lsdException w:name="Table List 8" w:semiHidden="1" w:unhideWhenUsed="1"/>
-    <w:lsdException w:name="Table 3D effects 1" w:semiHidden="1" w:unhideWhenUsed="1"/>
-    <w:lsdException w:name="Table 3D effects 2" w:semiHidden="1" w:unhideWhenUsed="1"/>
-    <w:lsdException w:name="Table 3D effects 3" w:semiHidden="1" w:unhideWhenUsed="1"/>
-    <w:lsdException w:name="Table Contemporary" w:semiHidden="1" w:unhideWhenUsed="1"/>
-    <w:lsdException w:name="Table Elegant" w:semiHidden="1" w:unhideWhenUsed="1"/>
-    <w:lsdException w:name="Table Professional" w:semiHidden="1" w:unhideWhenUsed="1"/>
-    <w:lsdException w:name="Table Subtle 1" w:semiHidden="1" w:unhideWhenUsed="1"/>
-    <w:lsdException w:name="Table Subtle 2" w:semiHidden="1" w:unhideWhenUsed="1"/>
-    <w:lsdException w:name="Table Web 1" w:semiHidden="1" w:unhideWhenUsed="1"/>
-    <w:lsdException w:name="Table Web 2" w:semiHidden="1" w:unhideWhenUsed="1"/>
-    <w:lsdException w:name="Table Web 3" w:semiHidden="1" w:unhideWhenUsed="1"/>
-    <w:lsdException w:name="Balloon Text" w:semiHidden="1" w:unhideWhenUsed="1"/>
-    <w:lsdException w:name="Table Grid" w:uiPriority="39"/>
-    <w:lsdException w:name="Table Theme" w:semiHidden="1" w:unhideWhenUsed="1"/>
-    <w:lsdException w:name="Placeholder Text" w:semiHidden="1"/>
-    <w:lsdException w:name="No Spacing" w:uiPriority="1" w:qFormat="1"/>
-    <w:lsdException w:name="Light Shading" w:uiPriority="60"/>
-    <w:lsdException w:name="Light List" w:uiPriority="61"/>
-    <w:lsdException w:name="Light Grid" w:uiPriority="62"/>
-    <w:lsdException w:name="Medium Shading 1" w:uiPriority="63"/>
-    <w:lsdException w:name="Medium Shading 2" w:uiPriority="64"/>
-    <w:lsdException w:name="Medium List 1" w:uiPriority="65"/>
-    <w:lsdException w:name="Medium List 2" w:uiPriority="66"/>
-    <w:lsdException w:name="Medium Grid 1" w:uiPriority="67"/>
-    <w:lsdException w:name="Medium Grid 2" w:uiPriority="68"/>
-    <w:lsdException w:name="Medium Grid 3" w:uiPriority="69"/>
-    <w:lsdException w:name="Dark List" w:uiPriority="70"/>
-    <w:lsdException w:name="Colorful Shading" w:uiPriority="71"/>
-    <w:lsdException w:name="Colorful List" w:uiPriority="72"/>
-    <w:lsdException w:name="Colorful Grid" w:uiPriority="73"/>
-    <w:lsdException w:name="Light Shading Accent 1" w:uiPriority="60"/>
-    <w:lsdException w:name="Light List Accent 1" w:uiPriority="61"/>
-    <w:lsdException w:name="Light Grid Accent 1" w:uiPriority="62"/>
-    <w:lsdException w:name="Medium Shading 1 Accent 1" w:uiPriority="63"/>
-    <w:lsdException w:name="Medium Shading 2 Accent 1" w:uiPriority="64"/>
-    <w:lsdException w:name="Medium List 1 Accent 1" w:uiPriority="65"/>
-    <w:lsdException w:name="Revision" w:semiHidden="1"/>
-    <w:lsdException w:name="List Paragraph" w:uiPriority="34" w:qFormat="1"/>
-    <w:lsdException w:name="Quote" w:uiPriority="29" w:qFormat="1"/>
-    <w:lsdException w:name="Intense Quote" w:uiPriority="30" w:qFormat="1"/>
-    <w:lsdException w:name="Medium List 2 Accent 1" w:uiPriority="66"/>
-    <w:lsdException w:name="Medium Grid 1 Accent 1" w:uiPriority="67"/>
-    <w:lsdException w:name="Medium Grid 2 Accent 1" w:uiPriority="68"/>
-    <w:lsdException w:name="Medium Grid 3 Accent 1" w:uiPriority="69"/>
-    <w:lsdException w:name="Dark List Accent 1" w:uiPriority="70"/>
-    <w:lsdException w:name="Colorful Shading Accent 1" w:uiPriority="71"/>
-    <w:lsdException w:name="Colorful List Accent 1" w:uiPriority="72"/>
-    <w:lsdException w:name="Colorful Grid Accent 1" w:uiPriority="73"/>
-    <w:lsdException w:name="Light Shading Accent 2" w:uiPriority="60"/>
-    <w:lsdException w:name="Light List Accent 2" w:uiPriority="61"/>
-    <w:lsdException w:name="Light Grid Accent 2" w:uiPriority="62"/>
-    <w:lsdException w:name="Medium Shading 1 Accent 2" w:uiPriority="63"/>
-    <w:lsdException w:name="Medium Shading 2 Accent 2" w:uiPriority="64"/>
-    <w:lsdException w:name="Medium List 1 Accent 2" w:uiPriority="65"/>
-    <w:lsdException w:name="Medium List 2 Accent 2" w:uiPriority="66"/>
-    <w:lsdException w:name="Medium Grid 1 Accent 2" w:uiPriority="67"/>
-    <w:lsdException w:name="Medium Grid 2 Accent 2" w:uiPriority="68"/>
-    <w:lsdException w:name="Medium Grid 3 Accent 2" w:uiPriority="69"/>
-    <w:lsdException w:name="Dark List Accent 2" w:uiPriority="70"/>
-    <w:lsdException w:name="Colorful Shading Accent 2" w:uiPriority="71"/>
-    <w:lsdException w:name="Colorful List Accent 2" w:uiPriority="72"/>
-    <w:lsdException w:name="Colorful Grid Accent 2" w:uiPriority="73"/>
-    <w:lsdException w:name="Light Shading Accent 3" w:uiPriority="60"/>
-    <w:lsdException w:name="Light List Accent 3" w:uiPriority="61"/>
-    <w:lsdException w:name="Light Grid Accent 3" w:uiPriority="62"/>
-    <w:lsdException w:name="Medium Shading 1 Accent 3" w:uiPriority="63"/>
-    <w:lsdException w:name="Medium Shading 2 Accent 3" w:uiPriority="64"/>
-    <w:lsdException w:name="Medium List 1 Accent 3" w:uiPriority="65"/>
-    <w:lsdException w:name="Medium List 2 Accent 3" w:uiPriority="66"/>
-    <w:lsdException w:name="Medium Grid 1 Accent 3" w:uiPriority="67"/>
-    <w:lsdException w:name="Medium Grid 2 Accent 3" w:uiPriority="68"/>
-    <w:lsdException w:name="Medium Grid 3 Accent 3" w:uiPriority="69"/>
-    <w:lsdException w:name="Dark List Accent 3" w:uiPriority="70"/>
-    <w:lsdException w:name="Colorful Shading Accent 3" w:uiPriority="71"/>
-    <w:lsdException w:name="Colorful List Accent 3" w:uiPriority="72"/>
-    <w:lsdException w:name="Colorful Grid Accent 3" w:uiPriority="73"/>
-    <w:lsdException w:name="Light Shading Accent 4" w:uiPriority="60"/>
-    <w:lsdException w:name="Light List Accent 4" w:uiPriority="61"/>
-    <w:lsdException w:name="Light Grid Accent 4" w:uiPriority="62"/>
-    <w:lsdException w:name="Medium Shading 1 Accent 4" w:uiPriority="63"/>
-    <w:lsdException w:name="Medium Shading 2 Accent 4" w:uiPriority="64"/>
-    <w:lsdException w:name="Medium List 1 Accent 4" w:uiPriority="65"/>
-    <w:lsdException w:name="Medium List 2 Accent 4" w:uiPriority="66"/>
-    <w:lsdException w:name="Medium Grid 1 Accent 4" w:uiPriority="67"/>
-    <w:lsdException w:name="Medium Grid 2 Accent 4" w:uiPriority="68"/>
-    <w:lsdException w:name="Medium Grid 3 Accent 4" w:uiPriority="69"/>
-    <w:lsdException w:name="Dark List Accent 4" w:uiPriority="70"/>
-    <w:lsdException w:name="Colorful Shading Accent 4" w:uiPriority="71"/>
-    <w:lsdException w:name="Colorful List Accent 4" w:uiPriority="72"/>
-    <w:lsdException w:name="Colorful Grid Accent 4" w:uiPriority="73"/>
-    <w:lsdException w:name="Light Shading Accent 5" w:uiPriority="60"/>
-    <w:lsdException w:name="Light List Accent 5" w:uiPriority="61"/>
-    <w:lsdException w:name="Light Grid Accent 5" w:uiPriority="62"/>
-    <w:lsdException w:name="Medium Shading 1 Accent 5" w:uiPriority="63"/>
-    <w:lsdException w:name="Medium Shading 2 Accent 5" w:uiPriority="64"/>
-    <w:lsdException w:name="Medium List 1 Accent 5" w:uiPriority="65"/>
-    <w:lsdException w:name="Medium List 2 Accent 5" w:uiPriority="66"/>
-    <w:lsdException w:name="Medium Grid 1 Accent 5" w:uiPriority="67"/>
-    <w:lsdException w:name="Medium Grid 2 Accent 5" w:uiPriority="68"/>
-    <w:lsdException w:name="Medium Grid 3 Accent 5" w:uiPriority="69"/>
-    <w:lsdException w:name="Dark List Accent 5" w:uiPriority="70"/>
-    <w:lsdException w:name="Colorful Shading Accent 5" w:uiPriority="71"/>
-    <w:lsdException w:name="Colorful List Accent 5" w:uiPriority="72"/>
-    <w:lsdException w:name="Colorful Grid Accent 5" w:uiPriority="73"/>
-    <w:lsdException w:name="Light Shading Accent 6" w:uiPriority="60"/>
-    <w:lsdException w:name="Light List Accent 6" w:uiPriority="61"/>
-    <w:lsdException w:name="Light Grid Accent 6" w:uiPriority="62"/>
-    <w:lsdException w:name="Medium Shading 1 Accent 6" w:uiPriority="63"/>
-    <w:lsdException w:name="Medium Shading 2 Accent 6" w:uiPriority="64"/>
-    <w:lsdException w:name="Medium List 1 Accent 6" w:uiPriority="65"/>
-    <w:lsdException w:name="Medium List 2 Accent 6" w:uiPriority="66"/>
-    <w:lsdException w:name="Medium Grid 1 Accent 6" w:uiPriority="67"/>
-    <w:lsdException w:name="Medium Grid 2 Accent 6" w:uiPriority="68"/>
-    <w:lsdException w:name="Medium Grid 3 Accent 6" w:uiPriority="69"/>
-    <w:lsdException w:name="Dark List Accent 6" w:uiPriority="70"/>
-    <w:lsdException w:name="Colorful Shading Accent 6" w:uiPriority="71"/>
-    <w:lsdException w:name="Colorful List Accent 6" w:uiPriority="72"/>
-    <w:lsdException w:name="Colorful Grid Accent 6" w:uiPriority="73"/>
-    <w:lsdException w:name="Subtle Emphasis" w:uiPriority="19" w:qFormat="1"/>
-    <w:lsdException w:name="Intense Emphasis" w:uiPriority="21" w:qFormat="1"/>
-    <w:lsdException w:name="Subtle Reference" w:uiPriority="31" w:qFormat="1"/>
-    <w:lsdException w:name="Intense Reference" w:uiPriority="32" w:qFormat="1"/>
-    <w:lsdException w:name="Book Title" w:uiPriority="33" w:qFormat="1"/>
-    <w:lsdException w:name="Bibliography" w:semiHidden="1" w:uiPriority="37" w:unhideWhenUsed="1"/>
-    <w:lsdException w:name="TOC Heading" w:semiHidden="1" w:uiPriority="39" w:unhideWhenUsed="1" w:qFormat="1"/>
-    <w:lsdException w:name="Plain Table 1" w:uiPriority="41"/>
-    <w:lsdException w:name="Plain Table 2" w:uiPriority="42"/>
-    <w:lsdException w:name="Plain Table 3" w:uiPriority="43"/>
-    <w:lsdException w:name="Plain Table 4" w:uiPriority="44"/>
-    <w:lsdException w:name="Plain Table 5" w:uiPriority="45"/>
-    <w:lsdException w:name="Grid Table Light" w:uiPriority="40"/>
-    <w:lsdException w:name="Grid Table 1 Light" w:uiPriority="46"/>
-    <w:lsdException w:name="Grid Table 2" w:uiPriority="47"/>
-    <w:lsdException w:name="Grid Table 3" w:uiPriority="48"/>
-    <w:lsdException w:name="Grid Table 4" w:uiPriority="49"/>
-    <w:lsdException w:name="Grid Table 5 Dark" w:uiPriority="50"/>
-    <w:lsdException w:name="Grid Table 6 Colorful" w:uiPriority="51"/>
-    <w:lsdException w:name="Grid Table 7 Colorful" w:uiPriority="52"/>
-    <w:lsdException w:name="Grid Table 1 Light Accent 1" w:uiPriority="46"/>
-    <w:lsdException w:name="Grid Table 2 Accent 1" w:uiPriority="47"/>
-    <w:lsdException w:name="Grid Table 3 Accent 1" w:uiPriority="48"/>
-    <w:lsdException w:name="Grid Table 4 Accent 1" w:uiPriority="49"/>
-    <w:lsdException w:name="Grid Table 5 Dark Accent 1" w:uiPriority="50"/>
-    <w:lsdException w:name="Grid Table 6 Colorful Accent 1" w:uiPriority="51"/>
-    <w:lsdException w:name="Grid Table 7 Colorful Accent 1" w:uiPriority="52"/>
-    <w:lsdException w:name="Grid Table 1 Light Accent 2" w:uiPriority="46"/>
-    <w:lsdException w:name="Grid Table 2 Accent 2" w:uiPriority="47"/>
-    <w:lsdException w:name="Grid Table 3 Accent 2" w:uiPriority="48"/>
-    <w:lsdException w:name="Grid Table 4 Accent 2" w:uiPriority="49"/>
-    <w:lsdException w:name="Grid Table 5 Dark Accent 2" w:uiPriority="50"/>
-    <w:lsdException w:name="Grid Table 6 Colorful Accent 2" w:uiPriority="51"/>
-    <w:lsdException w:name="Grid Table 7 Colorful Accent 2" w:uiPriority="52"/>
-    <w:lsdException w:name="Grid Table 1 Light Accent 3" w:uiPriority="46"/>
-    <w:lsdException w:name="Grid Table 2 Accent 3" w:uiPriority="47"/>
-    <w:lsdException w:name="Grid Table 3 Accent 3" w:uiPriority="48"/>
-    <w:lsdException w:name="Grid Table 4 Accent 3" w:uiPriority="49"/>
-    <w:lsdException w:name="Grid Table 5 Dark Accent 3" w:uiPriority="50"/>
-    <w:lsdException w:name="Grid Table 6 Colorful Accent 3" w:uiPriority="51"/>
-    <w:lsdException w:name="Grid Table 7 Colorful Accent 3" w:uiPriority="52"/>
-    <w:lsdException w:name="Grid Table 1 Light Accent 4" w:uiPriority="46"/>
-    <w:lsdException w:name="Grid Table 2 Accent 4" w:uiPriority="47"/>
-    <w:lsdException w:name="Grid Table 3 Accent 4" w:uiPriority="48"/>
-    <w:lsdException w:name="Grid Table 4 Accent 4" w:uiPriority="49"/>
-    <w:lsdException w:name="Grid Table 5 Dark Accent 4" w:uiPriority="50"/>
-    <w:lsdException w:name="Grid Table 6 Colorful Accent 4" w:uiPriority="51"/>
-    <w:lsdException w:name="Grid Table 7 Colorful Accent 4" w:uiPriority="52"/>
-    <w:lsdException w:name="Grid Table 1 Light Accent 5" w:uiPriority="46"/>
-    <w:lsdException w:name="Grid Table 2 Accent 5" w:uiPriority="47"/>
-    <w:lsdException w:name="Grid Table 3 Accent 5" w:uiPriority="48"/>
-    <w:lsdException w:name="Grid Table 4 Accent 5" w:uiPriority="49"/>
-    <w:lsdException w:name="Grid Table 5 Dark Accent 5" w:uiPriority="50"/>
-    <w:lsdException w:name="Grid Table 6 Colorful Accent 5" w:uiPriority="51"/>
-    <w:lsdException w:name="Grid Table 7 Colorful Accent 5" w:uiPriority="52"/>
-    <w:lsdException w:name="Grid Table 1 Light Accent 6" w:uiPriority="46"/>
-    <w:lsdException w:name="Grid Table 2 Accent 6" w:uiPriority="47"/>
-    <w:lsdException w:name="Grid Table 3 Accent 6" w:uiPriority="48"/>
-    <w:lsdException w:name="Grid Table 4 Accent 6" w:uiPriority="49"/>
-    <w:lsdException w:name="Grid Table 5 Dark Accent 6" w:uiPriority="50"/>
-    <w:lsdException w:name="Grid Table 6 Colorful Accent 6" w:uiPriority="51"/>
-    <w:lsdException w:name="Grid Table 7 Colorful Accent 6" w:uiPriority="52"/>
-    <w:lsdException w:name="List Table 1 Light" w:uiPriority="46"/>
-    <w:lsdException w:name="List Table 2" w:uiPriority="47"/>
-    <w:lsdException w:name="List Table 3" w:uiPriority="48"/>
-    <w:lsdException w:name="List Table 4" w:uiPriority="49"/>
-    <w:lsdException w:name="List Table 5 Dark" w:uiPriority="50"/>
-    <w:lsdException w:name="List Table 6 Colorful" w:uiPriority="51"/>
-    <w:lsdException w:name="List Table 7 Colorful" w:uiPriority="52"/>
-    <w:lsdException w:name="List Table 1 Light Accent 1" w:uiPriority="46"/>
-    <w:lsdException w:name="List Table 2 Accent 1" w:uiPriority="47"/>
-    <w:lsdException w:name="List Table 3 Accent 1" w:uiPriority="48"/>
-    <w:lsdException w:name="List Table 4 Accent 1" w:uiPriority="49"/>
-    <w:lsdException w:name="List Table 5 Dark Accent 1" w:uiPriority="50"/>
-    <w:lsdException w:name="List Table 6 Colorful Accent 1" w:uiPriority="51"/>
-    <w:lsdException w:name="List Table 7 Colorful Accent 1" w:uiPriority="52"/>
-    <w:lsdException w:name="List Table 1 Light Accent 2" w:uiPriority="46"/>
-    <w:lsdException w:name="List Table 2 Accent 2" w:uiPriority="47"/>
-    <w:lsdException w:name="List Table 3 Accent 2" w:uiPriority="48"/>
-    <w:lsdException w:name="List Table 4 Accent 2" w:uiPriority="49"/>
-    <w:lsdException w:name="List Table 5 Dark Accent 2" w:uiPriority="50"/>
-    <w:lsdException w:name="List Table 6 Colorful Accent 2" w:uiPriority="51"/>
-    <w:lsdException w:name="List Table 7 Colorful Accent 2" w:uiPriority="52"/>
-    <w:lsdException w:name="List Table 1 Light Accent 3" w:uiPriority="46"/>
-    <w:lsdException w:name="List Table 2 Accent 3" w:uiPriority="47"/>
-    <w:lsdException w:name="List Table 3 Accent 3" w:uiPriority="48"/>
-    <w:lsdException w:name="List Table 4 Accent 3" w:uiPriority="49"/>
-    <w:lsdException w:name="List Table 5 Dark Accent 3" w:uiPriority="50"/>
-    <w:lsdException w:name="List Table 6 Colorful Accent 3" w:uiPriority="51"/>
-    <w:lsdException w:name="List Table 7 Colorful Accent 3" w:uiPriority="52"/>
-    <w:lsdException w:name="List Table 1 Light Accent 4" w:uiPriority="46"/>
-    <w:lsdException w:name="List Table 2 Accent 4" w:uiPriority="47"/>
-    <w:lsdException w:name="List Table 3 Accent 4" w:uiPriority="48"/>
-    <w:lsdException w:name="List Table 4 Accent 4" w:uiPriority="49"/>
-    <w:lsdException w:name="List Table 5 Dark Accent 4" w:uiPriority="50"/>
-    <w:lsdException w:name="List Table 6 Colorful Accent 4" w:uiPriority="51"/>
-    <w:lsdException w:name="List Table 7 Colorful Accent 4" w:uiPriority="52"/>
-    <w:lsdException w:name="List Table 1 Light Accent 5" w:uiPriority="46"/>
-    <w:lsdException w:name="List Table 2 Accent 5" w:uiPriority="47"/>
-    <w:lsdException w:name="List Table 3 Accent 5" w:uiPriority="48"/>
-    <w:lsdException w:name="List Table 4 Accent 5" w:uiPriority="49"/>
-    <w:lsdException w:name="List Table 5 Dark Accent 5" w:uiPriority="50"/>
-    <w:lsdException w:name="List Table 6 Colorful Accent 5" w:uiPriority="51"/>
-    <w:lsdException w:name="List Table 7 Colorful Accent 5" w:uiPriority="52"/>
-    <w:lsdException w:name="List Table 1 Light Accent 6" w:uiPriority="46"/>
-    <w:lsdException w:name="List Table 2 Accent 6" w:uiPriority="47"/>
-    <w:lsdException w:name="List Table 3 Accent 6" w:uiPriority="48"/>
-    <w:lsdException w:name="List Table 4 Accent 6" w:uiPriority="49"/>
-    <w:lsdException w:name="List Table 5 Dark Accent 6" w:uiPriority="50"/>
-    <w:lsdException w:name="List Table 6 Colorful Accent 6" w:uiPriority="51"/>
-    <w:lsdException w:name="List Table 7 Colorful Accent 6" w:uiPriority="52"/>
-    <w:lsdException w:name="Mention" w:semiHidden="1" w:unhideWhenUsed="1"/>
-    <w:lsdException w:name="Smart Hyperlink" w:semiHidden="1" w:unhideWhenUsed="1"/>
-    <w:lsdException w:name="Hashtag" w:semiHidden="1" w:unhideWhenUsed="1"/>
-    <w:lsdException w:name="Unresolved Mention" w:semiHidden="1" w:unhideWhenUsed="1"/>
-    <w:lsdException w:name="Smart Link" w:semiHidden="1" w:unhideWhenUsed="1"/>
+  <w:latentStyles w:defLockedState="0" w:defUIPriority="99" w:defSemiHidden="1" w:defUnhideWhenUsed="1" w:defQFormat="0" w:count="267">
+    <w:lsdException w:name="Normal" w:semiHidden="0" w:uiPriority="0" w:unhideWhenUsed="0" w:qFormat="1"/>
+    <w:lsdException w:name="heading 1" w:semiHidden="0" w:uiPriority="9" w:unhideWhenUsed="0" w:qFormat="1"/>
+    <w:lsdException w:name="heading 2" w:uiPriority="9" w:qFormat="1"/>
+    <w:lsdException w:name="heading 3" w:uiPriority="9" w:qFormat="1"/>
+    <w:lsdException w:name="heading 4" w:uiPriority="9" w:qFormat="1"/>
+    <w:lsdException w:name="heading 5" w:uiPriority="9" w:qFormat="1"/>
+    <w:lsdException w:name="heading 6" w:uiPriority="9" w:qFormat="1"/>
+    <w:lsdException w:name="heading 7" w:uiPriority="9" w:qFormat="1"/>
+    <w:lsdException w:name="heading 8" w:uiPriority="9" w:qFormat="1"/>
+    <w:lsdException w:name="heading 9" w:uiPriority="9" w:qFormat="1"/>
+    <w:lsdException w:name="toc 1" w:uiPriority="39"/>
+    <w:lsdException w:name="toc 2" w:uiPriority="39"/>
+    <w:lsdException w:name="toc 3" w:uiPriority="39"/>
+    <w:lsdException w:name="toc 4" w:uiPriority="39"/>
+    <w:lsdException w:name="toc 5" w:uiPriority="39"/>
+    <w:lsdException w:name="toc 6" w:uiPriority="39"/>
+    <w:lsdException w:name="toc 7" w:uiPriority="39"/>
+    <w:lsdException w:name="toc 8" w:uiPriority="39"/>
+    <w:lsdException w:name="toc 9" w:uiPriority="39"/>
+    <w:lsdException w:name="caption" w:uiPriority="35" w:qFormat="1"/>
+    <w:lsdException w:name="Title" w:semiHidden="0" w:uiPriority="10" w:unhideWhenUsed="0" w:qFormat="1"/>
+    <w:lsdException w:name="Default Paragraph Font" w:uiPriority="1"/>
+    <w:lsdException w:name="Subtitle" w:semiHidden="0" w:uiPriority="11" w:unhideWhenUsed="0" w:qFormat="1"/>
+    <w:lsdException w:name="Strong" w:semiHidden="0" w:uiPriority="22" w:unhideWhenUsed="0" w:qFormat="1"/>
+    <w:lsdException w:name="Emphasis" w:semiHidden="0" w:uiPriority="20" w:unhideWhenUsed="0" w:qFormat="1"/>
+    <w:lsdException w:name="Table Grid" w:semiHidden="0" w:uiPriority="39" w:unhideWhenUsed="0"/>
+    <w:lsdException w:name="Placeholder Text" w:unhideWhenUsed="0"/>
+    <w:lsdException w:name="No Spacing" w:semiHidden="0" w:uiPriority="1" w:unhideWhenUsed="0" w:qFormat="1"/>
+    <w:lsdException w:name="Light Shading" w:semiHidden="0" w:uiPriority="60" w:unhideWhenUsed="0"/>
+    <w:lsdException w:name="Light List" w:semiHidden="0" w:uiPriority="61" w:unhideWhenUsed="0"/>
+    <w:lsdException w:name="Light Grid" w:semiHidden="0" w:uiPriority="62" w:unhideWhenUsed="0"/>
+    <w:lsdException w:name="Medium Shading 1" w:semiHidden="0" w:uiPriority="63" w:unhideWhenUsed="0"/>
+    <w:lsdException w:name="Medium Shading 2" w:semiHidden="0" w:uiPriority="64" w:unhideWhenUsed="0"/>
+    <w:lsdException w:name="Medium List 1" w:semiHidden="0" w:uiPriority="65" w:unhideWhenUsed="0"/>
+    <w:lsdException w:name="Medium List 2" w:semiHidden="0" w:uiPriority="66" w:unhideWhenUsed="0"/>
+    <w:lsdException w:name="Medium Grid 1" w:semiHidden="0" w:uiPriority="67" w:unhideWhenUsed="0"/>
+    <w:lsdException w:name="Medium Grid 2" w:semiHidden="0" w:uiPriority="68" w:unhideWhenUsed="0"/>
+    <w:lsdException w:name="Medium Grid 3" w:semiHidden="0" w:uiPriority="69" w:unhideWhenUsed="0"/>
+    <w:lsdException w:name="Dark List" w:semiHidden="0" w:uiPriority="70" w:unhideWhenUsed="0"/>
+    <w:lsdException w:name="Colorful Shading" w:semiHidden="0" w:uiPriority="71" w:unhideWhenUsed="0"/>
+    <w:lsdException w:name="Colorful List" w:semiHidden="0" w:uiPriority="72" w:unhideWhenUsed="0"/>
+    <w:lsdException w:name="Colorful Grid" w:semiHidden="0" w:uiPriority="73" w:unhideWhenUsed="0"/>
+    <w:lsdException w:name="Light Shading Accent 1" w:semiHidden="0" w:uiPriority="60" w:unhideWhenUsed="0"/>
+    <w:lsdException w:name="Light List Accent 1" w:semiHidden="0" w:uiPriority="61" w:unhideWhenUsed="0"/>
+    <w:lsdException w:name="Light Grid Accent 1" w:semiHidden="0" w:uiPriority="62" w:unhideWhenUsed="0"/>
+    <w:lsdException w:name="Medium Shading 1 Accent 1" w:semiHidden="0" w:uiPriority="63" w:unhideWhenUsed="0"/>
+    <w:lsdException w:name="Medium Shading 2 Accent 1" w:semiHidden="0" w:uiPriority="64" w:unhideWhenUsed="0"/>
+    <w:lsdException w:name="Medium List 1 Accent 1" w:semiHidden="0" w:uiPriority="65" w:unhideWhenUsed="0"/>
+    <w:lsdException w:name="Revision" w:unhideWhenUsed="0"/>
+    <w:lsdException w:name="List Paragraph" w:semiHidden="0" w:uiPriority="34" w:unhideWhenUsed="0" w:qFormat="1"/>
+    <w:lsdException w:name="Quote" w:semiHidden="0" w:uiPriority="29" w:unhideWhenUsed="0" w:qFormat="1"/>
+    <w:lsdException w:name="Intense Quote" w:semiHidden="0" w:uiPriority="30" w:unhideWhenUsed="0" w:qFormat="1"/>
+    <w:lsdException w:name="Medium List 2 Accent 1" w:semiHidden="0" w:uiPriority="66" w:unhideWhenUsed="0"/>
+    <w:lsdException w:name="Medium Grid 1 Accent 1" w:semiHidden="0" w:uiPriority="67" w:unhideWhenUsed="0"/>
+    <w:lsdException w:name="Medium Grid 2 Accent 1" w:semiHidden="0" w:uiPriority="68" w:unhideWhenUsed="0"/>
+    <w:lsdException w:name="Medium Grid 3 Accent 1" w:semiHidden="0" w:uiPriority="69" w:unhideWhenUsed="0"/>
+    <w:lsdException w:name="Dark List Accent 1" w:semiHidden="0" w:uiPriority="70" w:unhideWhenUsed="0"/>
+    <w:lsdException w:name="Colorful Shading Accent 1" w:semiHidden="0" w:uiPriority="71" w:unhideWhenUsed="0"/>
+    <w:lsdException w:name="Colorful List Accent 1" w:semiHidden="0" w:uiPriority="72" w:unhideWhenUsed="0"/>
+    <w:lsdException w:name="Colorful Grid Accent 1" w:semiHidden="0" w:uiPriority="73" w:unhideWhenUsed="0"/>
+    <w:lsdException w:name="Light Shading Accent 2" w:semiHidden="0" w:uiPriority="60" w:unhideWhenUsed="0"/>
+    <w:lsdException w:name="Light List Accent 2" w:semiHidden="0" w:uiPriority="61" w:unhideWhenUsed="0"/>
+    <w:lsdException w:name="Light Grid Accent 2" w:semiHidden="0" w:uiPriority="62" w:unhideWhenUsed="0"/>
+    <w:lsdException w:name="Medium Shading 1 Accent 2" w:semiHidden="0" w:uiPriority="63" w:unhideWhenUsed="0"/>
+    <w:lsdException w:name="Medium Shading 2 Accent 2" w:semiHidden="0" w:uiPriority="64" w:unhideWhenUsed="0"/>
+    <w:lsdException w:name="Medium List 1 Accent 2" w:semiHidden="0" w:uiPriority="65" w:unhideWhenUsed="0"/>
+    <w:lsdException w:name="Medium List 2 Accent 2" w:semiHidden="0" w:uiPriority="66" w:unhideWhenUsed="0"/>
+    <w:lsdException w:name="Medium Grid 1 Accent 2" w:semiHidden="0" w:uiPriority="67" w:unhideWhenUsed="0"/>
+    <w:lsdException w:name="Medium Grid 2 Accent 2" w:semiHidden="0" w:uiPriority="68" w:unhideWhenUsed="0"/>
+    <w:lsdException w:name="Medium Grid 3 Accent 2" w:semiHidden="0" w:uiPriority="69" w:unhideWhenUsed="0"/>
+    <w:lsdException w:name="Dark List Accent 2" w:semiHidden="0" w:uiPriority="70" w:unhideWhenUsed="0"/>
+    <w:lsdException w:name="Colorful Shading Accent 2" w:semiHidden="0" w:uiPriority="71" w:unhideWhenUsed="0"/>
+    <w:lsdException w:name="Colorful List Accent 2" w:semiHidden="0" w:uiPriority="72" w:unhideWhenUsed="0"/>
+    <w:lsdException w:name="Colorful Grid Accent 2" w:semiHidden="0" w:uiPriority="73" w:unhideWhenUsed="0"/>
+    <w:lsdException w:name="Light Shading Accent 3" w:semiHidden="0" w:uiPriority="60" w:unhideWhenUsed="0"/>
+    <w:lsdException w:name="Light List Accent 3" w:semiHidden="0" w:uiPriority="61" w:unhideWhenUsed="0"/>
+    <w:lsdException w:name="Light Grid Accent 3" w:semiHidden="0" w:uiPriority="62" w:unhideWhenUsed="0"/>
+    <w:lsdException w:name="Medium Shading 1 Accent 3" w:semiHidden="0" w:uiPriority="63" w:unhideWhenUsed="0"/>
+    <w:lsdException w:name="Medium Shading 2 Accent 3" w:semiHidden="0" w:uiPriority="64" w:unhideWhenUsed="0"/>
+    <w:lsdException w:name="Medium List 1 Accent 3" w:semiHidden="0" w:uiPriority="65" w:unhideWhenUsed="0"/>
+    <w:lsdException w:name="Medium List 2 Accent 3" w:semiHidden="0" w:uiPriority="66" w:unhideWhenUsed="0"/>
+    <w:lsdException w:name="Medium Grid 1 Accent 3" w:semiHidden="0" w:uiPriority="67" w:unhideWhenUsed="0"/>
+    <w:lsdException w:name="Medium Grid 2 Accent 3" w:semiHidden="0" w:uiPriority="68" w:unhideWhenUsed="0"/>
+    <w:lsdException w:name="Medium Grid 3 Accent 3" w:semiHidden="0" w:uiPriority="69" w:unhideWhenUsed="0"/>
+    <w:lsdException w:name="Dark List Accent 3" w:semiHidden="0" w:uiPriority="70" w:unhideWhenUsed="0"/>
+    <w:lsdException w:name="Colorful Shading Accent 3" w:semiHidden="0" w:uiPriority="71" w:unhideWhenUsed="0"/>
+    <w:lsdException w:name="Colorful List Accent 3" w:semiHidden="0" w:uiPriority="72" w:unhideWhenUsed="0"/>
+    <w:lsdException w:name="Colorful Grid Accent 3" w:semiHidden="0" w:uiPriority="73" w:unhideWhenUsed="0"/>
+    <w:lsdException w:name="Light Shading Accent 4" w:semiHidden="0" w:uiPriority="60" w:unhideWhenUsed="0"/>
+    <w:lsdException w:name="Light List Accent 4" w:semiHidden="0" w:uiPriority="61" w:unhideWhenUsed="0"/>
+    <w:lsdException w:name="Light Grid Accent 4" w:semiHidden="0" w:uiPriority="62" w:unhideWhenUsed="0"/>
+    <w:lsdException w:name="Medium Shading 1 Accent 4" w:semiHidden="0" w:uiPriority="63" w:unhideWhenUsed="0"/>
+    <w:lsdException w:name="Medium Shading 2 Accent 4" w:semiHidden="0" w:uiPriority="64" w:unhideWhenUsed="0"/>
+    <w:lsdException w:name="Medium List 1 Accent 4" w:semiHidden="0" w:uiPriority="65" w:unhideWhenUsed="0"/>
+    <w:lsdException w:name="Medium List 2 Accent 4" w:semiHidden="0" w:uiPriority="66" w:unhideWhenUsed="0"/>
+    <w:lsdException w:name="Medium Grid 1 Accent 4" w:semiHidden="0" w:uiPriority="67" w:unhideWhenUsed="0"/>
+    <w:lsdException w:name="Medium Grid 2 Accent 4" w:semiHidden="0" w:uiPriority="68" w:unhideWhenUsed="0"/>
+    <w:lsdException w:name="Medium Grid 3 Accent 4" w:semiHidden="0" w:uiPriority="69" w:unhideWhenUsed="0"/>
+    <w:lsdException w:name="Dark List Accent 4" w:semiHidden="0" w:uiPriority="70" w:unhideWhenUsed="0"/>
+    <w:lsdException w:name="Colorful Shading Accent 4" w:semiHidden="0" w:uiPriority="71" w:unhideWhenUsed="0"/>
+    <w:lsdException w:name="Colorful List Accent 4" w:semiHidden="0" w:uiPriority="72" w:unhideWhenUsed="0"/>
+    <w:lsdException w:name="Colorful Grid Accent 4" w:semiHidden="0" w:uiPriority="73" w:unhideWhenUsed="0"/>
+    <w:lsdException w:name="Light Shading Accent 5" w:semiHidden="0" w:uiPriority="60" w:unhideWhenUsed="0"/>
+    <w:lsdException w:name="Light List Accent 5" w:semiHidden="0" w:uiPriority="61" w:unhideWhenUsed="0"/>
+    <w:lsdException w:name="Light Grid Accent 5" w:semiHidden="0" w:uiPriority="62" w:unhideWhenUsed="0"/>
+    <w:lsdException w:name="Medium Shading 1 Accent 5" w:semiHidden="0" w:uiPriority="63" w:unhideWhenUsed="0"/>
+    <w:lsdException w:name="Medium Shading 2 Accent 5" w:semiHidden="0" w:uiPriority="64" w:unhideWhenUsed="0"/>
+    <w:lsdException w:name="Medium List 1 Accent 5" w:semiHidden="0" w:uiPriority="65" w:unhideWhenUsed="0"/>
+    <w:lsdException w:name="Medium List 2 Accent 5" w:semiHidden="0" w:uiPriority="66" w:unhideWhenUsed="0"/>
+    <w:lsdException w:name="Medium Grid 1 Accent 5" w:semiHidden="0" w:uiPriority="67" w:unhideWhenUsed="0"/>
+    <w:lsdException w:name="Medium Grid 2 Accent 5" w:semiHidden="0" w:uiPriority="68" w:unhideWhenUsed="0"/>
+    <w:lsdException w:name="Medium Grid 3 Accent 5" w:semiHidden="0" w:uiPriority="69" w:unhideWhenUsed="0"/>
+    <w:lsdException w:name="Dark List Accent 5" w:semiHidden="0" w:uiPriority="70" w:unhideWhenUsed="0"/>
+    <w:lsdException w:name="Colorful Shading Accent 5" w:semiHidden="0" w:uiPriority="71" w:unhideWhenUsed="0"/>
+    <w:lsdException w:name="Colorful List Accent 5" w:semiHidden="0" w:uiPriority="72" w:unhideWhenUsed="0"/>
+    <w:lsdException w:name="Colorful Grid Accent 5" w:semiHidden="0" w:uiPriority="73" w:unhideWhenUsed="0"/>
+    <w:lsdException w:name="Light Shading Accent 6" w:semiHidden="0" w:uiPriority="60" w:unhideWhenUsed="0"/>
+    <w:lsdException w:name="Light List Accent 6" w:semiHidden="0" w:uiPriority="61" w:unhideWhenUsed="0"/>
+    <w:lsdException w:name="Light Grid Accent 6" w:semiHidden="0" w:uiPriority="62" w:unhideWhenUsed="0"/>
+    <w:lsdException w:name="Medium Shading 1 Accent 6" w:semiHidden="0" w:uiPriority="63" w:unhideWhenUsed="0"/>
+    <w:lsdException w:name="Medium Shading 2 Accent 6" w:semiHidden="0" w:uiPriority="64" w:unhideWhenUsed="0"/>
+    <w:lsdException w:name="Medium List 1 Accent 6" w:semiHidden="0" w:uiPriority="65" w:unhideWhenUsed="0"/>
+    <w:lsdException w:name="Medium List 2 Accent 6" w:semiHidden="0" w:uiPriority="66" w:unhideWhenUsed="0"/>
+    <w:lsdException w:name="Medium Grid 1 Accent 6" w:semiHidden="0" w:uiPriority="67" w:unhideWhenUsed="0"/>
+    <w:lsdException w:name="Medium Grid 2 Accent 6" w:semiHidden="0" w:uiPriority="68" w:unhideWhenUsed="0"/>
+    <w:lsdException w:name="Medium Grid 3 Accent 6" w:semiHidden="0" w:uiPriority="69" w:unhideWhenUsed="0"/>
+    <w:lsdException w:name="Dark List Accent 6" w:semiHidden="0" w:uiPriority="70" w:unhideWhenUsed="0"/>
+    <w:lsdException w:name="Colorful Shading Accent 6" w:semiHidden="0" w:uiPriority="71" w:unhideWhenUsed="0"/>
+    <w:lsdException w:name="Colorful List Accent 6" w:semiHidden="0" w:uiPriority="72" w:unhideWhenUsed="0"/>
+    <w:lsdException w:name="Colorful Grid Accent 6" w:semiHidden="0" w:uiPriority="73" w:unhideWhenUsed="0"/>
+    <w:lsdException w:name="Subtle Emphasis" w:semiHidden="0" w:uiPriority="19" w:unhideWhenUsed="0" w:qFormat="1"/>
+    <w:lsdException w:name="Intense Emphasis" w:semiHidden="0" w:uiPriority="21" w:unhideWhenUsed="0" w:qFormat="1"/>
+    <w:lsdException w:name="Subtle Reference" w:semiHidden="0" w:uiPriority="31" w:unhideWhenUsed="0" w:qFormat="1"/>
+    <w:lsdException w:name="Intense Reference" w:semiHidden="0" w:uiPriority="32" w:unhideWhenUsed="0" w:qFormat="1"/>
+    <w:lsdException w:name="Book Title" w:semiHidden="0" w:uiPriority="33" w:unhideWhenUsed="0" w:qFormat="1"/>
+    <w:lsdException w:name="Bibliography" w:uiPriority="37"/>
+    <w:lsdException w:name="TOC Heading" w:uiPriority="39" w:qFormat="1"/>
   </w:latentStyles>
   <w:style w:type="paragraph" w:default="1" w:styleId="Normal">
     <w:name w:val="Normal"/>
     <w:qFormat/>
   </w:style>
-  <w:style w:type="paragraph" w:styleId="Ttulo1">
+  <w:style w:type="paragraph" w:styleId="Cabealho1">
     <w:name w:val="heading 1"/>
     <w:basedOn w:val="Normal"/>
     <w:next w:val="Normal"/>
-    <w:link w:val="Ttulo1Char"/>
+    <w:link w:val="Cabealho1Carcter"/>
     <w:uiPriority w:val="9"/>
     <w:qFormat/>
     <w:rsid w:val="00681F58"/>
@@ -2471,11 +2125,11 @@
       <w:szCs w:val="40"/>
     </w:rPr>
   </w:style>
-  <w:style w:type="paragraph" w:styleId="Ttulo2">
+  <w:style w:type="paragraph" w:styleId="Cabealho2">
     <w:name w:val="heading 2"/>
     <w:basedOn w:val="Normal"/>
     <w:next w:val="Normal"/>
-    <w:link w:val="Ttulo2Char"/>
+    <w:link w:val="Cabealho2Carcter"/>
     <w:uiPriority w:val="9"/>
     <w:semiHidden/>
     <w:unhideWhenUsed/>
@@ -2494,11 +2148,11 @@
       <w:szCs w:val="32"/>
     </w:rPr>
   </w:style>
-  <w:style w:type="paragraph" w:styleId="Ttulo3">
+  <w:style w:type="paragraph" w:styleId="Cabealho3">
     <w:name w:val="heading 3"/>
     <w:basedOn w:val="Normal"/>
     <w:next w:val="Normal"/>
-    <w:link w:val="Ttulo3Char"/>
+    <w:link w:val="Cabealho3Carcter"/>
     <w:uiPriority w:val="9"/>
     <w:semiHidden/>
     <w:unhideWhenUsed/>
@@ -2517,11 +2171,11 @@
       <w:szCs w:val="28"/>
     </w:rPr>
   </w:style>
-  <w:style w:type="paragraph" w:styleId="Ttulo4">
+  <w:style w:type="paragraph" w:styleId="Cabealho4">
     <w:name w:val="heading 4"/>
     <w:basedOn w:val="Normal"/>
     <w:next w:val="Normal"/>
-    <w:link w:val="Ttulo4Char"/>
+    <w:link w:val="Cabealho4Carcter"/>
     <w:uiPriority w:val="9"/>
     <w:semiHidden/>
     <w:unhideWhenUsed/>
@@ -2540,11 +2194,11 @@
       <w:color w:val="0F4761" w:themeColor="accent1" w:themeShade="BF"/>
     </w:rPr>
   </w:style>
-  <w:style w:type="paragraph" w:styleId="Ttulo5">
+  <w:style w:type="paragraph" w:styleId="Cabealho5">
     <w:name w:val="heading 5"/>
     <w:basedOn w:val="Normal"/>
     <w:next w:val="Normal"/>
-    <w:link w:val="Ttulo5Char"/>
+    <w:link w:val="Cabealho5Carcter"/>
     <w:uiPriority w:val="9"/>
     <w:semiHidden/>
     <w:unhideWhenUsed/>
@@ -2561,11 +2215,11 @@
       <w:color w:val="0F4761" w:themeColor="accent1" w:themeShade="BF"/>
     </w:rPr>
   </w:style>
-  <w:style w:type="paragraph" w:styleId="Ttulo6">
+  <w:style w:type="paragraph" w:styleId="Cabealho6">
     <w:name w:val="heading 6"/>
     <w:basedOn w:val="Normal"/>
     <w:next w:val="Normal"/>
-    <w:link w:val="Ttulo6Char"/>
+    <w:link w:val="Cabealho6Carcter"/>
     <w:uiPriority w:val="9"/>
     <w:semiHidden/>
     <w:unhideWhenUsed/>
@@ -2584,11 +2238,11 @@
       <w:color w:val="595959" w:themeColor="text1" w:themeTint="A6"/>
     </w:rPr>
   </w:style>
-  <w:style w:type="paragraph" w:styleId="Ttulo7">
+  <w:style w:type="paragraph" w:styleId="Cabealho7">
     <w:name w:val="heading 7"/>
     <w:basedOn w:val="Normal"/>
     <w:next w:val="Normal"/>
-    <w:link w:val="Ttulo7Char"/>
+    <w:link w:val="Cabealho7Carcter"/>
     <w:uiPriority w:val="9"/>
     <w:semiHidden/>
     <w:unhideWhenUsed/>
@@ -2605,11 +2259,11 @@
       <w:color w:val="595959" w:themeColor="text1" w:themeTint="A6"/>
     </w:rPr>
   </w:style>
-  <w:style w:type="paragraph" w:styleId="Ttulo8">
+  <w:style w:type="paragraph" w:styleId="Cabealho8">
     <w:name w:val="heading 8"/>
     <w:basedOn w:val="Normal"/>
     <w:next w:val="Normal"/>
-    <w:link w:val="Ttulo8Char"/>
+    <w:link w:val="Cabealho8Carcter"/>
     <w:uiPriority w:val="9"/>
     <w:semiHidden/>
     <w:unhideWhenUsed/>
@@ -2628,11 +2282,11 @@
       <w:color w:val="272727" w:themeColor="text1" w:themeTint="D8"/>
     </w:rPr>
   </w:style>
-  <w:style w:type="paragraph" w:styleId="Ttulo9">
+  <w:style w:type="paragraph" w:styleId="Cabealho9">
     <w:name w:val="heading 9"/>
     <w:basedOn w:val="Normal"/>
     <w:next w:val="Normal"/>
-    <w:link w:val="Ttulo9Char"/>
+    <w:link w:val="Cabealho9Carcter"/>
     <w:uiPriority w:val="9"/>
     <w:semiHidden/>
     <w:unhideWhenUsed/>
@@ -2649,9 +2303,10 @@
       <w:color w:val="272727" w:themeColor="text1" w:themeTint="D8"/>
     </w:rPr>
   </w:style>
-  <w:style w:type="character" w:default="1" w:styleId="Fontepargpadro">
+  <w:style w:type="character" w:default="1" w:styleId="Tipodeletrapredefinidodopargrafo">
     <w:name w:val="Default Paragraph Font"/>
     <w:uiPriority w:val="1"/>
+    <w:semiHidden/>
     <w:unhideWhenUsed/>
   </w:style>
   <w:style w:type="table" w:default="1" w:styleId="Tabelanormal">
@@ -2675,10 +2330,10 @@
     <w:semiHidden/>
     <w:unhideWhenUsed/>
   </w:style>
-  <w:style w:type="character" w:customStyle="1" w:styleId="Ttulo1Char">
-    <w:name w:val="Título 1 Char"/>
-    <w:basedOn w:val="Fontepargpadro"/>
-    <w:link w:val="Ttulo1"/>
+  <w:style w:type="character" w:customStyle="1" w:styleId="Cabealho1Carcter">
+    <w:name w:val="Cabeçalho 1 Carácter"/>
+    <w:basedOn w:val="Tipodeletrapredefinidodopargrafo"/>
+    <w:link w:val="Cabealho1"/>
     <w:uiPriority w:val="9"/>
     <w:rsid w:val="00681F58"/>
     <w:rPr>
@@ -2688,10 +2343,10 @@
       <w:szCs w:val="40"/>
     </w:rPr>
   </w:style>
-  <w:style w:type="character" w:customStyle="1" w:styleId="Ttulo2Char">
-    <w:name w:val="Título 2 Char"/>
-    <w:basedOn w:val="Fontepargpadro"/>
-    <w:link w:val="Ttulo2"/>
+  <w:style w:type="character" w:customStyle="1" w:styleId="Cabealho2Carcter">
+    <w:name w:val="Cabeçalho 2 Carácter"/>
+    <w:basedOn w:val="Tipodeletrapredefinidodopargrafo"/>
+    <w:link w:val="Cabealho2"/>
     <w:uiPriority w:val="9"/>
     <w:semiHidden/>
     <w:rsid w:val="00681F58"/>
@@ -2702,10 +2357,10 @@
       <w:szCs w:val="32"/>
     </w:rPr>
   </w:style>
-  <w:style w:type="character" w:customStyle="1" w:styleId="Ttulo3Char">
-    <w:name w:val="Título 3 Char"/>
-    <w:basedOn w:val="Fontepargpadro"/>
-    <w:link w:val="Ttulo3"/>
+  <w:style w:type="character" w:customStyle="1" w:styleId="Cabealho3Carcter">
+    <w:name w:val="Cabeçalho 3 Carácter"/>
+    <w:basedOn w:val="Tipodeletrapredefinidodopargrafo"/>
+    <w:link w:val="Cabealho3"/>
     <w:uiPriority w:val="9"/>
     <w:semiHidden/>
     <w:rsid w:val="00681F58"/>
@@ -2716,10 +2371,10 @@
       <w:szCs w:val="28"/>
     </w:rPr>
   </w:style>
-  <w:style w:type="character" w:customStyle="1" w:styleId="Ttulo4Char">
-    <w:name w:val="Título 4 Char"/>
-    <w:basedOn w:val="Fontepargpadro"/>
-    <w:link w:val="Ttulo4"/>
+  <w:style w:type="character" w:customStyle="1" w:styleId="Cabealho4Carcter">
+    <w:name w:val="Cabeçalho 4 Carácter"/>
+    <w:basedOn w:val="Tipodeletrapredefinidodopargrafo"/>
+    <w:link w:val="Cabealho4"/>
     <w:uiPriority w:val="9"/>
     <w:semiHidden/>
     <w:rsid w:val="00681F58"/>
@@ -2730,10 +2385,10 @@
       <w:color w:val="0F4761" w:themeColor="accent1" w:themeShade="BF"/>
     </w:rPr>
   </w:style>
-  <w:style w:type="character" w:customStyle="1" w:styleId="Ttulo5Char">
-    <w:name w:val="Título 5 Char"/>
-    <w:basedOn w:val="Fontepargpadro"/>
-    <w:link w:val="Ttulo5"/>
+  <w:style w:type="character" w:customStyle="1" w:styleId="Cabealho5Carcter">
+    <w:name w:val="Cabeçalho 5 Carácter"/>
+    <w:basedOn w:val="Tipodeletrapredefinidodopargrafo"/>
+    <w:link w:val="Cabealho5"/>
     <w:uiPriority w:val="9"/>
     <w:semiHidden/>
     <w:rsid w:val="00681F58"/>
@@ -2742,10 +2397,10 @@
       <w:color w:val="0F4761" w:themeColor="accent1" w:themeShade="BF"/>
     </w:rPr>
   </w:style>
-  <w:style w:type="character" w:customStyle="1" w:styleId="Ttulo6Char">
-    <w:name w:val="Título 6 Char"/>
-    <w:basedOn w:val="Fontepargpadro"/>
-    <w:link w:val="Ttulo6"/>
+  <w:style w:type="character" w:customStyle="1" w:styleId="Cabealho6Carcter">
+    <w:name w:val="Cabeçalho 6 Carácter"/>
+    <w:basedOn w:val="Tipodeletrapredefinidodopargrafo"/>
+    <w:link w:val="Cabealho6"/>
     <w:uiPriority w:val="9"/>
     <w:semiHidden/>
     <w:rsid w:val="00681F58"/>
@@ -2756,10 +2411,10 @@
       <w:color w:val="595959" w:themeColor="text1" w:themeTint="A6"/>
     </w:rPr>
   </w:style>
-  <w:style w:type="character" w:customStyle="1" w:styleId="Ttulo7Char">
-    <w:name w:val="Título 7 Char"/>
-    <w:basedOn w:val="Fontepargpadro"/>
-    <w:link w:val="Ttulo7"/>
+  <w:style w:type="character" w:customStyle="1" w:styleId="Cabealho7Carcter">
+    <w:name w:val="Cabeçalho 7 Carácter"/>
+    <w:basedOn w:val="Tipodeletrapredefinidodopargrafo"/>
+    <w:link w:val="Cabealho7"/>
     <w:uiPriority w:val="9"/>
     <w:semiHidden/>
     <w:rsid w:val="00681F58"/>
@@ -2768,10 +2423,10 @@
       <w:color w:val="595959" w:themeColor="text1" w:themeTint="A6"/>
     </w:rPr>
   </w:style>
-  <w:style w:type="character" w:customStyle="1" w:styleId="Ttulo8Char">
-    <w:name w:val="Título 8 Char"/>
-    <w:basedOn w:val="Fontepargpadro"/>
-    <w:link w:val="Ttulo8"/>
+  <w:style w:type="character" w:customStyle="1" w:styleId="Cabealho8Carcter">
+    <w:name w:val="Cabeçalho 8 Carácter"/>
+    <w:basedOn w:val="Tipodeletrapredefinidodopargrafo"/>
+    <w:link w:val="Cabealho8"/>
     <w:uiPriority w:val="9"/>
     <w:semiHidden/>
     <w:rsid w:val="00681F58"/>
@@ -2782,10 +2437,10 @@
       <w:color w:val="272727" w:themeColor="text1" w:themeTint="D8"/>
     </w:rPr>
   </w:style>
-  <w:style w:type="character" w:customStyle="1" w:styleId="Ttulo9Char">
-    <w:name w:val="Título 9 Char"/>
-    <w:basedOn w:val="Fontepargpadro"/>
-    <w:link w:val="Ttulo9"/>
+  <w:style w:type="character" w:customStyle="1" w:styleId="Cabealho9Carcter">
+    <w:name w:val="Cabeçalho 9 Carácter"/>
+    <w:basedOn w:val="Tipodeletrapredefinidodopargrafo"/>
+    <w:link w:val="Cabealho9"/>
     <w:uiPriority w:val="9"/>
     <w:semiHidden/>
     <w:rsid w:val="00681F58"/>
@@ -2798,7 +2453,7 @@
     <w:name w:val="Title"/>
     <w:basedOn w:val="Normal"/>
     <w:next w:val="Normal"/>
-    <w:link w:val="TtuloChar"/>
+    <w:link w:val="TtuloCarcter"/>
     <w:uiPriority w:val="10"/>
     <w:qFormat/>
     <w:rsid w:val="00681F58"/>
@@ -2814,9 +2469,9 @@
       <w:szCs w:val="56"/>
     </w:rPr>
   </w:style>
-  <w:style w:type="character" w:customStyle="1" w:styleId="TtuloChar">
-    <w:name w:val="Título Char"/>
-    <w:basedOn w:val="Fontepargpadro"/>
+  <w:style w:type="character" w:customStyle="1" w:styleId="TtuloCarcter">
+    <w:name w:val="Título Carácter"/>
+    <w:basedOn w:val="Tipodeletrapredefinidodopargrafo"/>
     <w:link w:val="Ttulo"/>
     <w:uiPriority w:val="10"/>
     <w:rsid w:val="00681F58"/>
@@ -2832,7 +2487,7 @@
     <w:name w:val="Subtitle"/>
     <w:basedOn w:val="Normal"/>
     <w:next w:val="Normal"/>
-    <w:link w:val="SubttuloChar"/>
+    <w:link w:val="SubttuloCarcter"/>
     <w:uiPriority w:val="11"/>
     <w:qFormat/>
     <w:rsid w:val="00681F58"/>
@@ -2849,9 +2504,9 @@
       <w:szCs w:val="28"/>
     </w:rPr>
   </w:style>
-  <w:style w:type="character" w:customStyle="1" w:styleId="SubttuloChar">
-    <w:name w:val="Subtítulo Char"/>
-    <w:basedOn w:val="Fontepargpadro"/>
+  <w:style w:type="character" w:customStyle="1" w:styleId="SubttuloCarcter">
+    <w:name w:val="Subtítulo Carácter"/>
+    <w:basedOn w:val="Tipodeletrapredefinidodopargrafo"/>
     <w:link w:val="Subttulo"/>
     <w:uiPriority w:val="11"/>
     <w:rsid w:val="00681F58"/>
@@ -2867,7 +2522,7 @@
     <w:name w:val="Quote"/>
     <w:basedOn w:val="Normal"/>
     <w:next w:val="Normal"/>
-    <w:link w:val="CitaoChar"/>
+    <w:link w:val="CitaoCarcter"/>
     <w:uiPriority w:val="29"/>
     <w:qFormat/>
     <w:rsid w:val="00681F58"/>
@@ -2881,9 +2536,9 @@
       <w:color w:val="404040" w:themeColor="text1" w:themeTint="BF"/>
     </w:rPr>
   </w:style>
-  <w:style w:type="character" w:customStyle="1" w:styleId="CitaoChar">
-    <w:name w:val="Citação Char"/>
-    <w:basedOn w:val="Fontepargpadro"/>
+  <w:style w:type="character" w:customStyle="1" w:styleId="CitaoCarcter">
+    <w:name w:val="Citação Carácter"/>
+    <w:basedOn w:val="Tipodeletrapredefinidodopargrafo"/>
     <w:link w:val="Citao"/>
     <w:uiPriority w:val="29"/>
     <w:rsid w:val="00681F58"/>
@@ -2904,9 +2559,9 @@
       <w:contextualSpacing/>
     </w:pPr>
   </w:style>
-  <w:style w:type="character" w:styleId="nfaseIntensa">
+  <w:style w:type="character" w:styleId="nfaseIntenso">
     <w:name w:val="Intense Emphasis"/>
-    <w:basedOn w:val="Fontepargpadro"/>
+    <w:basedOn w:val="Tipodeletrapredefinidodopargrafo"/>
     <w:uiPriority w:val="21"/>
     <w:qFormat/>
     <w:rsid w:val="00681F58"/>
@@ -2920,7 +2575,7 @@
     <w:name w:val="Intense Quote"/>
     <w:basedOn w:val="Normal"/>
     <w:next w:val="Normal"/>
-    <w:link w:val="CitaoIntensaChar"/>
+    <w:link w:val="CitaoIntensaCarcter"/>
     <w:uiPriority w:val="30"/>
     <w:qFormat/>
     <w:rsid w:val="00681F58"/>
@@ -2939,9 +2594,9 @@
       <w:color w:val="0F4761" w:themeColor="accent1" w:themeShade="BF"/>
     </w:rPr>
   </w:style>
-  <w:style w:type="character" w:customStyle="1" w:styleId="CitaoIntensaChar">
-    <w:name w:val="Citação Intensa Char"/>
-    <w:basedOn w:val="Fontepargpadro"/>
+  <w:style w:type="character" w:customStyle="1" w:styleId="CitaoIntensaCarcter">
+    <w:name w:val="Citação Intensa Carácter"/>
+    <w:basedOn w:val="Tipodeletrapredefinidodopargrafo"/>
     <w:link w:val="CitaoIntensa"/>
     <w:uiPriority w:val="30"/>
     <w:rsid w:val="00681F58"/>
@@ -2953,7 +2608,7 @@
   </w:style>
   <w:style w:type="character" w:styleId="RefernciaIntensa">
     <w:name w:val="Intense Reference"/>
-    <w:basedOn w:val="Fontepargpadro"/>
+    <w:basedOn w:val="Tipodeletrapredefinidodopargrafo"/>
     <w:uiPriority w:val="32"/>
     <w:qFormat/>
     <w:rsid w:val="00681F58"/>
@@ -2965,9 +2620,9 @@
       <w:spacing w:val="5"/>
     </w:rPr>
   </w:style>
-  <w:style w:type="character" w:styleId="Hyperlink">
+  <w:style w:type="character" w:styleId="Hiperligao">
     <w:name w:val="Hyperlink"/>
-    <w:basedOn w:val="Fontepargpadro"/>
+    <w:basedOn w:val="Tipodeletrapredefinidodopargrafo"/>
     <w:uiPriority w:val="99"/>
     <w:unhideWhenUsed/>
     <w:rsid w:val="00681F58"/>
@@ -2976,9 +2631,9 @@
       <w:u w:val="single"/>
     </w:rPr>
   </w:style>
-  <w:style w:type="character" w:styleId="MenoPendente">
+  <w:style w:type="character" w:customStyle="1" w:styleId="UnresolvedMention">
     <w:name w:val="Unresolved Mention"/>
-    <w:basedOn w:val="Fontepargpadro"/>
+    <w:basedOn w:val="Tipodeletrapredefinidodopargrafo"/>
     <w:uiPriority w:val="99"/>
     <w:semiHidden/>
     <w:unhideWhenUsed/>
@@ -2988,9 +2643,9 @@
       <w:shd w:val="clear" w:color="auto" w:fill="E1DFDD"/>
     </w:rPr>
   </w:style>
-  <w:style w:type="paragraph" w:styleId="CabealhodoSumrio">
+  <w:style w:type="paragraph" w:styleId="Ttulodondice">
     <w:name w:val="TOC Heading"/>
-    <w:basedOn w:val="Ttulo1"/>
+    <w:basedOn w:val="Cabealho1"/>
     <w:next w:val="Normal"/>
     <w:uiPriority w:val="39"/>
     <w:unhideWhenUsed/>
@@ -3008,7 +2663,7 @@
       <w14:ligatures w14:val="none"/>
     </w:rPr>
   </w:style>
-  <w:style w:type="paragraph" w:styleId="Sumrio2">
+  <w:style w:type="paragraph" w:styleId="ndice2">
     <w:name w:val="toc 2"/>
     <w:basedOn w:val="Normal"/>
     <w:next w:val="Normal"/>
@@ -3027,7 +2682,7 @@
       <w14:ligatures w14:val="none"/>
     </w:rPr>
   </w:style>
-  <w:style w:type="paragraph" w:styleId="Sumrio1">
+  <w:style w:type="paragraph" w:styleId="ndice1">
     <w:name w:val="toc 1"/>
     <w:basedOn w:val="Normal"/>
     <w:next w:val="Normal"/>
@@ -3045,7 +2700,7 @@
       <w14:ligatures w14:val="none"/>
     </w:rPr>
   </w:style>
-  <w:style w:type="paragraph" w:styleId="Sumrio3">
+  <w:style w:type="paragraph" w:styleId="ndice3">
     <w:name w:val="toc 3"/>
     <w:basedOn w:val="Normal"/>
     <w:next w:val="Normal"/>
@@ -3062,6 +2717,846 @@
       <w:kern w:val="0"/>
       <w:lang w:eastAsia="pt-BR"/>
       <w14:ligatures w14:val="none"/>
+    </w:rPr>
+  </w:style>
+  <w:style w:type="paragraph" w:styleId="Textodebalo">
+    <w:name w:val="Balloon Text"/>
+    <w:basedOn w:val="Normal"/>
+    <w:link w:val="TextodebaloCarcter"/>
+    <w:uiPriority w:val="99"/>
+    <w:semiHidden/>
+    <w:unhideWhenUsed/>
+    <w:rsid w:val="006521EA"/>
+    <w:pPr>
+      <w:spacing w:after="0" w:line="240" w:lineRule="auto"/>
+    </w:pPr>
+    <w:rPr>
+      <w:rFonts w:ascii="Tahoma" w:hAnsi="Tahoma" w:cs="Tahoma"/>
+      <w:sz w:val="16"/>
+      <w:szCs w:val="16"/>
+    </w:rPr>
+  </w:style>
+  <w:style w:type="character" w:customStyle="1" w:styleId="TextodebaloCarcter">
+    <w:name w:val="Texto de balão Carácter"/>
+    <w:basedOn w:val="Tipodeletrapredefinidodopargrafo"/>
+    <w:link w:val="Textodebalo"/>
+    <w:uiPriority w:val="99"/>
+    <w:semiHidden/>
+    <w:rsid w:val="006521EA"/>
+    <w:rPr>
+      <w:rFonts w:ascii="Tahoma" w:hAnsi="Tahoma" w:cs="Tahoma"/>
+      <w:sz w:val="16"/>
+      <w:szCs w:val="16"/>
+    </w:rPr>
+  </w:style>
+</w:styles>
+</file>
+
+<file path=word/stylesWithEffects.xml><?xml version="1.0" encoding="utf-8"?>
+<w:styles xmlns:wpc="http://schemas.microsoft.com/office/word/2010/wordprocessingCanvas" xmlns:mc="http://schemas.openxmlformats.org/markup-compatibility/2006" xmlns:o="urn:schemas-microsoft-com:office:office" xmlns:r="http://schemas.openxmlformats.org/officeDocument/2006/relationships" xmlns:m="http://schemas.openxmlformats.org/officeDocument/2006/math" xmlns:v="urn:schemas-microsoft-com:vml" xmlns:wp14="http://schemas.microsoft.com/office/word/2010/wordprocessingDrawing" xmlns:wp="http://schemas.openxmlformats.org/drawingml/2006/wordprocessingDrawing" xmlns:w10="urn:schemas-microsoft-com:office:word" xmlns:w="http://schemas.openxmlformats.org/wordprocessingml/2006/main" xmlns:w14="http://schemas.microsoft.com/office/word/2010/wordml" xmlns:wpg="http://schemas.microsoft.com/office/word/2010/wordprocessingGroup" xmlns:wpi="http://schemas.microsoft.com/office/word/2010/wordprocessingInk" xmlns:wne="http://schemas.microsoft.com/office/word/2006/wordml" xmlns:wps="http://schemas.microsoft.com/office/word/2010/wordprocessingShape" mc:Ignorable="w14 wp14">
+  <w:docDefaults>
+    <w:rPrDefault>
+      <w:rPr>
+        <w:rFonts w:asciiTheme="minorHAnsi" w:eastAsiaTheme="minorHAnsi" w:hAnsiTheme="minorHAnsi" w:cstheme="minorBidi"/>
+        <w:kern w:val="2"/>
+        <w:sz w:val="22"/>
+        <w:szCs w:val="22"/>
+        <w:lang w:val="pt-BR" w:eastAsia="en-US" w:bidi="ar-SA"/>
+        <w14:ligatures w14:val="standardContextual"/>
+      </w:rPr>
+    </w:rPrDefault>
+    <w:pPrDefault>
+      <w:pPr>
+        <w:spacing w:after="160" w:line="259" w:lineRule="auto"/>
+      </w:pPr>
+    </w:pPrDefault>
+  </w:docDefaults>
+  <w:latentStyles w:defLockedState="0" w:defUIPriority="99" w:defSemiHidden="1" w:defUnhideWhenUsed="1" w:defQFormat="0" w:count="267">
+    <w:lsdException w:name="Normal" w:semiHidden="0" w:uiPriority="0" w:unhideWhenUsed="0" w:qFormat="1"/>
+    <w:lsdException w:name="heading 1" w:semiHidden="0" w:uiPriority="9" w:unhideWhenUsed="0" w:qFormat="1"/>
+    <w:lsdException w:name="heading 2" w:uiPriority="9" w:qFormat="1"/>
+    <w:lsdException w:name="heading 3" w:uiPriority="9" w:qFormat="1"/>
+    <w:lsdException w:name="heading 4" w:uiPriority="9" w:qFormat="1"/>
+    <w:lsdException w:name="heading 5" w:uiPriority="9" w:qFormat="1"/>
+    <w:lsdException w:name="heading 6" w:uiPriority="9" w:qFormat="1"/>
+    <w:lsdException w:name="heading 7" w:uiPriority="9" w:qFormat="1"/>
+    <w:lsdException w:name="heading 8" w:uiPriority="9" w:qFormat="1"/>
+    <w:lsdException w:name="heading 9" w:uiPriority="9" w:qFormat="1"/>
+    <w:lsdException w:name="toc 1" w:uiPriority="39"/>
+    <w:lsdException w:name="toc 2" w:uiPriority="39"/>
+    <w:lsdException w:name="toc 3" w:uiPriority="39"/>
+    <w:lsdException w:name="toc 4" w:uiPriority="39"/>
+    <w:lsdException w:name="toc 5" w:uiPriority="39"/>
+    <w:lsdException w:name="toc 6" w:uiPriority="39"/>
+    <w:lsdException w:name="toc 7" w:uiPriority="39"/>
+    <w:lsdException w:name="toc 8" w:uiPriority="39"/>
+    <w:lsdException w:name="toc 9" w:uiPriority="39"/>
+    <w:lsdException w:name="caption" w:uiPriority="35" w:qFormat="1"/>
+    <w:lsdException w:name="Title" w:semiHidden="0" w:uiPriority="10" w:unhideWhenUsed="0" w:qFormat="1"/>
+    <w:lsdException w:name="Default Paragraph Font" w:uiPriority="1"/>
+    <w:lsdException w:name="Subtitle" w:semiHidden="0" w:uiPriority="11" w:unhideWhenUsed="0" w:qFormat="1"/>
+    <w:lsdException w:name="Strong" w:semiHidden="0" w:uiPriority="22" w:unhideWhenUsed="0" w:qFormat="1"/>
+    <w:lsdException w:name="Emphasis" w:semiHidden="0" w:uiPriority="20" w:unhideWhenUsed="0" w:qFormat="1"/>
+    <w:lsdException w:name="Table Grid" w:semiHidden="0" w:uiPriority="39" w:unhideWhenUsed="0"/>
+    <w:lsdException w:name="Placeholder Text" w:unhideWhenUsed="0"/>
+    <w:lsdException w:name="No Spacing" w:semiHidden="0" w:uiPriority="1" w:unhideWhenUsed="0" w:qFormat="1"/>
+    <w:lsdException w:name="Light Shading" w:semiHidden="0" w:uiPriority="60" w:unhideWhenUsed="0"/>
+    <w:lsdException w:name="Light List" w:semiHidden="0" w:uiPriority="61" w:unhideWhenUsed="0"/>
+    <w:lsdException w:name="Light Grid" w:semiHidden="0" w:uiPriority="62" w:unhideWhenUsed="0"/>
+    <w:lsdException w:name="Medium Shading 1" w:semiHidden="0" w:uiPriority="63" w:unhideWhenUsed="0"/>
+    <w:lsdException w:name="Medium Shading 2" w:semiHidden="0" w:uiPriority="64" w:unhideWhenUsed="0"/>
+    <w:lsdException w:name="Medium List 1" w:semiHidden="0" w:uiPriority="65" w:unhideWhenUsed="0"/>
+    <w:lsdException w:name="Medium List 2" w:semiHidden="0" w:uiPriority="66" w:unhideWhenUsed="0"/>
+    <w:lsdException w:name="Medium Grid 1" w:semiHidden="0" w:uiPriority="67" w:unhideWhenUsed="0"/>
+    <w:lsdException w:name="Medium Grid 2" w:semiHidden="0" w:uiPriority="68" w:unhideWhenUsed="0"/>
+    <w:lsdException w:name="Medium Grid 3" w:semiHidden="0" w:uiPriority="69" w:unhideWhenUsed="0"/>
+    <w:lsdException w:name="Dark List" w:semiHidden="0" w:uiPriority="70" w:unhideWhenUsed="0"/>
+    <w:lsdException w:name="Colorful Shading" w:semiHidden="0" w:uiPriority="71" w:unhideWhenUsed="0"/>
+    <w:lsdException w:name="Colorful List" w:semiHidden="0" w:uiPriority="72" w:unhideWhenUsed="0"/>
+    <w:lsdException w:name="Colorful Grid" w:semiHidden="0" w:uiPriority="73" w:unhideWhenUsed="0"/>
+    <w:lsdException w:name="Light Shading Accent 1" w:semiHidden="0" w:uiPriority="60" w:unhideWhenUsed="0"/>
+    <w:lsdException w:name="Light List Accent 1" w:semiHidden="0" w:uiPriority="61" w:unhideWhenUsed="0"/>
+    <w:lsdException w:name="Light Grid Accent 1" w:semiHidden="0" w:uiPriority="62" w:unhideWhenUsed="0"/>
+    <w:lsdException w:name="Medium Shading 1 Accent 1" w:semiHidden="0" w:uiPriority="63" w:unhideWhenUsed="0"/>
+    <w:lsdException w:name="Medium Shading 2 Accent 1" w:semiHidden="0" w:uiPriority="64" w:unhideWhenUsed="0"/>
+    <w:lsdException w:name="Medium List 1 Accent 1" w:semiHidden="0" w:uiPriority="65" w:unhideWhenUsed="0"/>
+    <w:lsdException w:name="Revision" w:unhideWhenUsed="0"/>
+    <w:lsdException w:name="List Paragraph" w:semiHidden="0" w:uiPriority="34" w:unhideWhenUsed="0" w:qFormat="1"/>
+    <w:lsdException w:name="Quote" w:semiHidden="0" w:uiPriority="29" w:unhideWhenUsed="0" w:qFormat="1"/>
+    <w:lsdException w:name="Intense Quote" w:semiHidden="0" w:uiPriority="30" w:unhideWhenUsed="0" w:qFormat="1"/>
+    <w:lsdException w:name="Medium List 2 Accent 1" w:semiHidden="0" w:uiPriority="66" w:unhideWhenUsed="0"/>
+    <w:lsdException w:name="Medium Grid 1 Accent 1" w:semiHidden="0" w:uiPriority="67" w:unhideWhenUsed="0"/>
+    <w:lsdException w:name="Medium Grid 2 Accent 1" w:semiHidden="0" w:uiPriority="68" w:unhideWhenUsed="0"/>
+    <w:lsdException w:name="Medium Grid 3 Accent 1" w:semiHidden="0" w:uiPriority="69" w:unhideWhenUsed="0"/>
+    <w:lsdException w:name="Dark List Accent 1" w:semiHidden="0" w:uiPriority="70" w:unhideWhenUsed="0"/>
+    <w:lsdException w:name="Colorful Shading Accent 1" w:semiHidden="0" w:uiPriority="71" w:unhideWhenUsed="0"/>
+    <w:lsdException w:name="Colorful List Accent 1" w:semiHidden="0" w:uiPriority="72" w:unhideWhenUsed="0"/>
+    <w:lsdException w:name="Colorful Grid Accent 1" w:semiHidden="0" w:uiPriority="73" w:unhideWhenUsed="0"/>
+    <w:lsdException w:name="Light Shading Accent 2" w:semiHidden="0" w:uiPriority="60" w:unhideWhenUsed="0"/>
+    <w:lsdException w:name="Light List Accent 2" w:semiHidden="0" w:uiPriority="61" w:unhideWhenUsed="0"/>
+    <w:lsdException w:name="Light Grid Accent 2" w:semiHidden="0" w:uiPriority="62" w:unhideWhenUsed="0"/>
+    <w:lsdException w:name="Medium Shading 1 Accent 2" w:semiHidden="0" w:uiPriority="63" w:unhideWhenUsed="0"/>
+    <w:lsdException w:name="Medium Shading 2 Accent 2" w:semiHidden="0" w:uiPriority="64" w:unhideWhenUsed="0"/>
+    <w:lsdException w:name="Medium List 1 Accent 2" w:semiHidden="0" w:uiPriority="65" w:unhideWhenUsed="0"/>
+    <w:lsdException w:name="Medium List 2 Accent 2" w:semiHidden="0" w:uiPriority="66" w:unhideWhenUsed="0"/>
+    <w:lsdException w:name="Medium Grid 1 Accent 2" w:semiHidden="0" w:uiPriority="67" w:unhideWhenUsed="0"/>
+    <w:lsdException w:name="Medium Grid 2 Accent 2" w:semiHidden="0" w:uiPriority="68" w:unhideWhenUsed="0"/>
+    <w:lsdException w:name="Medium Grid 3 Accent 2" w:semiHidden="0" w:uiPriority="69" w:unhideWhenUsed="0"/>
+    <w:lsdException w:name="Dark List Accent 2" w:semiHidden="0" w:uiPriority="70" w:unhideWhenUsed="0"/>
+    <w:lsdException w:name="Colorful Shading Accent 2" w:semiHidden="0" w:uiPriority="71" w:unhideWhenUsed="0"/>
+    <w:lsdException w:name="Colorful List Accent 2" w:semiHidden="0" w:uiPriority="72" w:unhideWhenUsed="0"/>
+    <w:lsdException w:name="Colorful Grid Accent 2" w:semiHidden="0" w:uiPriority="73" w:unhideWhenUsed="0"/>
+    <w:lsdException w:name="Light Shading Accent 3" w:semiHidden="0" w:uiPriority="60" w:unhideWhenUsed="0"/>
+    <w:lsdException w:name="Light List Accent 3" w:semiHidden="0" w:uiPriority="61" w:unhideWhenUsed="0"/>
+    <w:lsdException w:name="Light Grid Accent 3" w:semiHidden="0" w:uiPriority="62" w:unhideWhenUsed="0"/>
+    <w:lsdException w:name="Medium Shading 1 Accent 3" w:semiHidden="0" w:uiPriority="63" w:unhideWhenUsed="0"/>
+    <w:lsdException w:name="Medium Shading 2 Accent 3" w:semiHidden="0" w:uiPriority="64" w:unhideWhenUsed="0"/>
+    <w:lsdException w:name="Medium List 1 Accent 3" w:semiHidden="0" w:uiPriority="65" w:unhideWhenUsed="0"/>
+    <w:lsdException w:name="Medium List 2 Accent 3" w:semiHidden="0" w:uiPriority="66" w:unhideWhenUsed="0"/>
+    <w:lsdException w:name="Medium Grid 1 Accent 3" w:semiHidden="0" w:uiPriority="67" w:unhideWhenUsed="0"/>
+    <w:lsdException w:name="Medium Grid 2 Accent 3" w:semiHidden="0" w:uiPriority="68" w:unhideWhenUsed="0"/>
+    <w:lsdException w:name="Medium Grid 3 Accent 3" w:semiHidden="0" w:uiPriority="69" w:unhideWhenUsed="0"/>
+    <w:lsdException w:name="Dark List Accent 3" w:semiHidden="0" w:uiPriority="70" w:unhideWhenUsed="0"/>
+    <w:lsdException w:name="Colorful Shading Accent 3" w:semiHidden="0" w:uiPriority="71" w:unhideWhenUsed="0"/>
+    <w:lsdException w:name="Colorful List Accent 3" w:semiHidden="0" w:uiPriority="72" w:unhideWhenUsed="0"/>
+    <w:lsdException w:name="Colorful Grid Accent 3" w:semiHidden="0" w:uiPriority="73" w:unhideWhenUsed="0"/>
+    <w:lsdException w:name="Light Shading Accent 4" w:semiHidden="0" w:uiPriority="60" w:unhideWhenUsed="0"/>
+    <w:lsdException w:name="Light List Accent 4" w:semiHidden="0" w:uiPriority="61" w:unhideWhenUsed="0"/>
+    <w:lsdException w:name="Light Grid Accent 4" w:semiHidden="0" w:uiPriority="62" w:unhideWhenUsed="0"/>
+    <w:lsdException w:name="Medium Shading 1 Accent 4" w:semiHidden="0" w:uiPriority="63" w:unhideWhenUsed="0"/>
+    <w:lsdException w:name="Medium Shading 2 Accent 4" w:semiHidden="0" w:uiPriority="64" w:unhideWhenUsed="0"/>
+    <w:lsdException w:name="Medium List 1 Accent 4" w:semiHidden="0" w:uiPriority="65" w:unhideWhenUsed="0"/>
+    <w:lsdException w:name="Medium List 2 Accent 4" w:semiHidden="0" w:uiPriority="66" w:unhideWhenUsed="0"/>
+    <w:lsdException w:name="Medium Grid 1 Accent 4" w:semiHidden="0" w:uiPriority="67" w:unhideWhenUsed="0"/>
+    <w:lsdException w:name="Medium Grid 2 Accent 4" w:semiHidden="0" w:uiPriority="68" w:unhideWhenUsed="0"/>
+    <w:lsdException w:name="Medium Grid 3 Accent 4" w:semiHidden="0" w:uiPriority="69" w:unhideWhenUsed="0"/>
+    <w:lsdException w:name="Dark List Accent 4" w:semiHidden="0" w:uiPriority="70" w:unhideWhenUsed="0"/>
+    <w:lsdException w:name="Colorful Shading Accent 4" w:semiHidden="0" w:uiPriority="71" w:unhideWhenUsed="0"/>
+    <w:lsdException w:name="Colorful List Accent 4" w:semiHidden="0" w:uiPriority="72" w:unhideWhenUsed="0"/>
+    <w:lsdException w:name="Colorful Grid Accent 4" w:semiHidden="0" w:uiPriority="73" w:unhideWhenUsed="0"/>
+    <w:lsdException w:name="Light Shading Accent 5" w:semiHidden="0" w:uiPriority="60" w:unhideWhenUsed="0"/>
+    <w:lsdException w:name="Light List Accent 5" w:semiHidden="0" w:uiPriority="61" w:unhideWhenUsed="0"/>
+    <w:lsdException w:name="Light Grid Accent 5" w:semiHidden="0" w:uiPriority="62" w:unhideWhenUsed="0"/>
+    <w:lsdException w:name="Medium Shading 1 Accent 5" w:semiHidden="0" w:uiPriority="63" w:unhideWhenUsed="0"/>
+    <w:lsdException w:name="Medium Shading 2 Accent 5" w:semiHidden="0" w:uiPriority="64" w:unhideWhenUsed="0"/>
+    <w:lsdException w:name="Medium List 1 Accent 5" w:semiHidden="0" w:uiPriority="65" w:unhideWhenUsed="0"/>
+    <w:lsdException w:name="Medium List 2 Accent 5" w:semiHidden="0" w:uiPriority="66" w:unhideWhenUsed="0"/>
+    <w:lsdException w:name="Medium Grid 1 Accent 5" w:semiHidden="0" w:uiPriority="67" w:unhideWhenUsed="0"/>
+    <w:lsdException w:name="Medium Grid 2 Accent 5" w:semiHidden="0" w:uiPriority="68" w:unhideWhenUsed="0"/>
+    <w:lsdException w:name="Medium Grid 3 Accent 5" w:semiHidden="0" w:uiPriority="69" w:unhideWhenUsed="0"/>
+    <w:lsdException w:name="Dark List Accent 5" w:semiHidden="0" w:uiPriority="70" w:unhideWhenUsed="0"/>
+    <w:lsdException w:name="Colorful Shading Accent 5" w:semiHidden="0" w:uiPriority="71" w:unhideWhenUsed="0"/>
+    <w:lsdException w:name="Colorful List Accent 5" w:semiHidden="0" w:uiPriority="72" w:unhideWhenUsed="0"/>
+    <w:lsdException w:name="Colorful Grid Accent 5" w:semiHidden="0" w:uiPriority="73" w:unhideWhenUsed="0"/>
+    <w:lsdException w:name="Light Shading Accent 6" w:semiHidden="0" w:uiPriority="60" w:unhideWhenUsed="0"/>
+    <w:lsdException w:name="Light List Accent 6" w:semiHidden="0" w:uiPriority="61" w:unhideWhenUsed="0"/>
+    <w:lsdException w:name="Light Grid Accent 6" w:semiHidden="0" w:uiPriority="62" w:unhideWhenUsed="0"/>
+    <w:lsdException w:name="Medium Shading 1 Accent 6" w:semiHidden="0" w:uiPriority="63" w:unhideWhenUsed="0"/>
+    <w:lsdException w:name="Medium Shading 2 Accent 6" w:semiHidden="0" w:uiPriority="64" w:unhideWhenUsed="0"/>
+    <w:lsdException w:name="Medium List 1 Accent 6" w:semiHidden="0" w:uiPriority="65" w:unhideWhenUsed="0"/>
+    <w:lsdException w:name="Medium List 2 Accent 6" w:semiHidden="0" w:uiPriority="66" w:unhideWhenUsed="0"/>
+    <w:lsdException w:name="Medium Grid 1 Accent 6" w:semiHidden="0" w:uiPriority="67" w:unhideWhenUsed="0"/>
+    <w:lsdException w:name="Medium Grid 2 Accent 6" w:semiHidden="0" w:uiPriority="68" w:unhideWhenUsed="0"/>
+    <w:lsdException w:name="Medium Grid 3 Accent 6" w:semiHidden="0" w:uiPriority="69" w:unhideWhenUsed="0"/>
+    <w:lsdException w:name="Dark List Accent 6" w:semiHidden="0" w:uiPriority="70" w:unhideWhenUsed="0"/>
+    <w:lsdException w:name="Colorful Shading Accent 6" w:semiHidden="0" w:uiPriority="71" w:unhideWhenUsed="0"/>
+    <w:lsdException w:name="Colorful List Accent 6" w:semiHidden="0" w:uiPriority="72" w:unhideWhenUsed="0"/>
+    <w:lsdException w:name="Colorful Grid Accent 6" w:semiHidden="0" w:uiPriority="73" w:unhideWhenUsed="0"/>
+    <w:lsdException w:name="Subtle Emphasis" w:semiHidden="0" w:uiPriority="19" w:unhideWhenUsed="0" w:qFormat="1"/>
+    <w:lsdException w:name="Intense Emphasis" w:semiHidden="0" w:uiPriority="21" w:unhideWhenUsed="0" w:qFormat="1"/>
+    <w:lsdException w:name="Subtle Reference" w:semiHidden="0" w:uiPriority="31" w:unhideWhenUsed="0" w:qFormat="1"/>
+    <w:lsdException w:name="Intense Reference" w:semiHidden="0" w:uiPriority="32" w:unhideWhenUsed="0" w:qFormat="1"/>
+    <w:lsdException w:name="Book Title" w:semiHidden="0" w:uiPriority="33" w:unhideWhenUsed="0" w:qFormat="1"/>
+    <w:lsdException w:name="Bibliography" w:uiPriority="37"/>
+    <w:lsdException w:name="TOC Heading" w:uiPriority="39" w:qFormat="1"/>
+  </w:latentStyles>
+  <w:style w:type="paragraph" w:default="1" w:styleId="Normal">
+    <w:name w:val="Normal"/>
+    <w:qFormat/>
+  </w:style>
+  <w:style w:type="paragraph" w:styleId="Cabealho1">
+    <w:name w:val="heading 1"/>
+    <w:basedOn w:val="Normal"/>
+    <w:next w:val="Normal"/>
+    <w:link w:val="Cabealho1Carcter"/>
+    <w:uiPriority w:val="9"/>
+    <w:qFormat/>
+    <w:rsid w:val="00681F58"/>
+    <w:pPr>
+      <w:keepNext/>
+      <w:keepLines/>
+      <w:spacing w:before="360" w:after="80"/>
+      <w:outlineLvl w:val="0"/>
+    </w:pPr>
+    <w:rPr>
+      <w:rFonts w:asciiTheme="majorHAnsi" w:eastAsiaTheme="majorEastAsia" w:hAnsiTheme="majorHAnsi" w:cstheme="majorBidi"/>
+      <w:color w:val="0F4761" w:themeColor="accent1" w:themeShade="BF"/>
+      <w:sz w:val="40"/>
+      <w:szCs w:val="40"/>
+    </w:rPr>
+  </w:style>
+  <w:style w:type="paragraph" w:styleId="Cabealho2">
+    <w:name w:val="heading 2"/>
+    <w:basedOn w:val="Normal"/>
+    <w:next w:val="Normal"/>
+    <w:link w:val="Cabealho2Carcter"/>
+    <w:uiPriority w:val="9"/>
+    <w:semiHidden/>
+    <w:unhideWhenUsed/>
+    <w:qFormat/>
+    <w:rsid w:val="00681F58"/>
+    <w:pPr>
+      <w:keepNext/>
+      <w:keepLines/>
+      <w:spacing w:before="160" w:after="80"/>
+      <w:outlineLvl w:val="1"/>
+    </w:pPr>
+    <w:rPr>
+      <w:rFonts w:asciiTheme="majorHAnsi" w:eastAsiaTheme="majorEastAsia" w:hAnsiTheme="majorHAnsi" w:cstheme="majorBidi"/>
+      <w:color w:val="0F4761" w:themeColor="accent1" w:themeShade="BF"/>
+      <w:sz w:val="32"/>
+      <w:szCs w:val="32"/>
+    </w:rPr>
+  </w:style>
+  <w:style w:type="paragraph" w:styleId="Cabealho3">
+    <w:name w:val="heading 3"/>
+    <w:basedOn w:val="Normal"/>
+    <w:next w:val="Normal"/>
+    <w:link w:val="Cabealho3Carcter"/>
+    <w:uiPriority w:val="9"/>
+    <w:semiHidden/>
+    <w:unhideWhenUsed/>
+    <w:qFormat/>
+    <w:rsid w:val="00681F58"/>
+    <w:pPr>
+      <w:keepNext/>
+      <w:keepLines/>
+      <w:spacing w:before="160" w:after="80"/>
+      <w:outlineLvl w:val="2"/>
+    </w:pPr>
+    <w:rPr>
+      <w:rFonts w:eastAsiaTheme="majorEastAsia" w:cstheme="majorBidi"/>
+      <w:color w:val="0F4761" w:themeColor="accent1" w:themeShade="BF"/>
+      <w:sz w:val="28"/>
+      <w:szCs w:val="28"/>
+    </w:rPr>
+  </w:style>
+  <w:style w:type="paragraph" w:styleId="Cabealho4">
+    <w:name w:val="heading 4"/>
+    <w:basedOn w:val="Normal"/>
+    <w:next w:val="Normal"/>
+    <w:link w:val="Cabealho4Carcter"/>
+    <w:uiPriority w:val="9"/>
+    <w:semiHidden/>
+    <w:unhideWhenUsed/>
+    <w:qFormat/>
+    <w:rsid w:val="00681F58"/>
+    <w:pPr>
+      <w:keepNext/>
+      <w:keepLines/>
+      <w:spacing w:before="80" w:after="40"/>
+      <w:outlineLvl w:val="3"/>
+    </w:pPr>
+    <w:rPr>
+      <w:rFonts w:eastAsiaTheme="majorEastAsia" w:cstheme="majorBidi"/>
+      <w:i/>
+      <w:iCs/>
+      <w:color w:val="0F4761" w:themeColor="accent1" w:themeShade="BF"/>
+    </w:rPr>
+  </w:style>
+  <w:style w:type="paragraph" w:styleId="Cabealho5">
+    <w:name w:val="heading 5"/>
+    <w:basedOn w:val="Normal"/>
+    <w:next w:val="Normal"/>
+    <w:link w:val="Cabealho5Carcter"/>
+    <w:uiPriority w:val="9"/>
+    <w:semiHidden/>
+    <w:unhideWhenUsed/>
+    <w:qFormat/>
+    <w:rsid w:val="00681F58"/>
+    <w:pPr>
+      <w:keepNext/>
+      <w:keepLines/>
+      <w:spacing w:before="80" w:after="40"/>
+      <w:outlineLvl w:val="4"/>
+    </w:pPr>
+    <w:rPr>
+      <w:rFonts w:eastAsiaTheme="majorEastAsia" w:cstheme="majorBidi"/>
+      <w:color w:val="0F4761" w:themeColor="accent1" w:themeShade="BF"/>
+    </w:rPr>
+  </w:style>
+  <w:style w:type="paragraph" w:styleId="Cabealho6">
+    <w:name w:val="heading 6"/>
+    <w:basedOn w:val="Normal"/>
+    <w:next w:val="Normal"/>
+    <w:link w:val="Cabealho6Carcter"/>
+    <w:uiPriority w:val="9"/>
+    <w:semiHidden/>
+    <w:unhideWhenUsed/>
+    <w:qFormat/>
+    <w:rsid w:val="00681F58"/>
+    <w:pPr>
+      <w:keepNext/>
+      <w:keepLines/>
+      <w:spacing w:before="40" w:after="0"/>
+      <w:outlineLvl w:val="5"/>
+    </w:pPr>
+    <w:rPr>
+      <w:rFonts w:eastAsiaTheme="majorEastAsia" w:cstheme="majorBidi"/>
+      <w:i/>
+      <w:iCs/>
+      <w:color w:val="595959" w:themeColor="text1" w:themeTint="A6"/>
+    </w:rPr>
+  </w:style>
+  <w:style w:type="paragraph" w:styleId="Cabealho7">
+    <w:name w:val="heading 7"/>
+    <w:basedOn w:val="Normal"/>
+    <w:next w:val="Normal"/>
+    <w:link w:val="Cabealho7Carcter"/>
+    <w:uiPriority w:val="9"/>
+    <w:semiHidden/>
+    <w:unhideWhenUsed/>
+    <w:qFormat/>
+    <w:rsid w:val="00681F58"/>
+    <w:pPr>
+      <w:keepNext/>
+      <w:keepLines/>
+      <w:spacing w:before="40" w:after="0"/>
+      <w:outlineLvl w:val="6"/>
+    </w:pPr>
+    <w:rPr>
+      <w:rFonts w:eastAsiaTheme="majorEastAsia" w:cstheme="majorBidi"/>
+      <w:color w:val="595959" w:themeColor="text1" w:themeTint="A6"/>
+    </w:rPr>
+  </w:style>
+  <w:style w:type="paragraph" w:styleId="Cabealho8">
+    <w:name w:val="heading 8"/>
+    <w:basedOn w:val="Normal"/>
+    <w:next w:val="Normal"/>
+    <w:link w:val="Cabealho8Carcter"/>
+    <w:uiPriority w:val="9"/>
+    <w:semiHidden/>
+    <w:unhideWhenUsed/>
+    <w:qFormat/>
+    <w:rsid w:val="00681F58"/>
+    <w:pPr>
+      <w:keepNext/>
+      <w:keepLines/>
+      <w:spacing w:after="0"/>
+      <w:outlineLvl w:val="7"/>
+    </w:pPr>
+    <w:rPr>
+      <w:rFonts w:eastAsiaTheme="majorEastAsia" w:cstheme="majorBidi"/>
+      <w:i/>
+      <w:iCs/>
+      <w:color w:val="272727" w:themeColor="text1" w:themeTint="D8"/>
+    </w:rPr>
+  </w:style>
+  <w:style w:type="paragraph" w:styleId="Cabealho9">
+    <w:name w:val="heading 9"/>
+    <w:basedOn w:val="Normal"/>
+    <w:next w:val="Normal"/>
+    <w:link w:val="Cabealho9Carcter"/>
+    <w:uiPriority w:val="9"/>
+    <w:semiHidden/>
+    <w:unhideWhenUsed/>
+    <w:qFormat/>
+    <w:rsid w:val="00681F58"/>
+    <w:pPr>
+      <w:keepNext/>
+      <w:keepLines/>
+      <w:spacing w:after="0"/>
+      <w:outlineLvl w:val="8"/>
+    </w:pPr>
+    <w:rPr>
+      <w:rFonts w:eastAsiaTheme="majorEastAsia" w:cstheme="majorBidi"/>
+      <w:color w:val="272727" w:themeColor="text1" w:themeTint="D8"/>
+    </w:rPr>
+  </w:style>
+  <w:style w:type="character" w:default="1" w:styleId="Tipodeletrapredefinidodopargrafo">
+    <w:name w:val="Default Paragraph Font"/>
+    <w:uiPriority w:val="1"/>
+    <w:semiHidden/>
+    <w:unhideWhenUsed/>
+  </w:style>
+  <w:style w:type="table" w:default="1" w:styleId="Tabelanormal">
+    <w:name w:val="Normal Table"/>
+    <w:uiPriority w:val="99"/>
+    <w:semiHidden/>
+    <w:unhideWhenUsed/>
+    <w:tblPr>
+      <w:tblInd w:w="0" w:type="dxa"/>
+      <w:tblCellMar>
+        <w:top w:w="0" w:type="dxa"/>
+        <w:left w:w="108" w:type="dxa"/>
+        <w:bottom w:w="0" w:type="dxa"/>
+        <w:right w:w="108" w:type="dxa"/>
+      </w:tblCellMar>
+    </w:tblPr>
+  </w:style>
+  <w:style w:type="numbering" w:default="1" w:styleId="Semlista">
+    <w:name w:val="No List"/>
+    <w:uiPriority w:val="99"/>
+    <w:semiHidden/>
+    <w:unhideWhenUsed/>
+  </w:style>
+  <w:style w:type="character" w:customStyle="1" w:styleId="Cabealho1Carcter">
+    <w:name w:val="Cabeçalho 1 Carácter"/>
+    <w:basedOn w:val="Tipodeletrapredefinidodopargrafo"/>
+    <w:link w:val="Cabealho1"/>
+    <w:uiPriority w:val="9"/>
+    <w:rsid w:val="00681F58"/>
+    <w:rPr>
+      <w:rFonts w:asciiTheme="majorHAnsi" w:eastAsiaTheme="majorEastAsia" w:hAnsiTheme="majorHAnsi" w:cstheme="majorBidi"/>
+      <w:color w:val="0F4761" w:themeColor="accent1" w:themeShade="BF"/>
+      <w:sz w:val="40"/>
+      <w:szCs w:val="40"/>
+    </w:rPr>
+  </w:style>
+  <w:style w:type="character" w:customStyle="1" w:styleId="Cabealho2Carcter">
+    <w:name w:val="Cabeçalho 2 Carácter"/>
+    <w:basedOn w:val="Tipodeletrapredefinidodopargrafo"/>
+    <w:link w:val="Cabealho2"/>
+    <w:uiPriority w:val="9"/>
+    <w:semiHidden/>
+    <w:rsid w:val="00681F58"/>
+    <w:rPr>
+      <w:rFonts w:asciiTheme="majorHAnsi" w:eastAsiaTheme="majorEastAsia" w:hAnsiTheme="majorHAnsi" w:cstheme="majorBidi"/>
+      <w:color w:val="0F4761" w:themeColor="accent1" w:themeShade="BF"/>
+      <w:sz w:val="32"/>
+      <w:szCs w:val="32"/>
+    </w:rPr>
+  </w:style>
+  <w:style w:type="character" w:customStyle="1" w:styleId="Cabealho3Carcter">
+    <w:name w:val="Cabeçalho 3 Carácter"/>
+    <w:basedOn w:val="Tipodeletrapredefinidodopargrafo"/>
+    <w:link w:val="Cabealho3"/>
+    <w:uiPriority w:val="9"/>
+    <w:semiHidden/>
+    <w:rsid w:val="00681F58"/>
+    <w:rPr>
+      <w:rFonts w:eastAsiaTheme="majorEastAsia" w:cstheme="majorBidi"/>
+      <w:color w:val="0F4761" w:themeColor="accent1" w:themeShade="BF"/>
+      <w:sz w:val="28"/>
+      <w:szCs w:val="28"/>
+    </w:rPr>
+  </w:style>
+  <w:style w:type="character" w:customStyle="1" w:styleId="Cabealho4Carcter">
+    <w:name w:val="Cabeçalho 4 Carácter"/>
+    <w:basedOn w:val="Tipodeletrapredefinidodopargrafo"/>
+    <w:link w:val="Cabealho4"/>
+    <w:uiPriority w:val="9"/>
+    <w:semiHidden/>
+    <w:rsid w:val="00681F58"/>
+    <w:rPr>
+      <w:rFonts w:eastAsiaTheme="majorEastAsia" w:cstheme="majorBidi"/>
+      <w:i/>
+      <w:iCs/>
+      <w:color w:val="0F4761" w:themeColor="accent1" w:themeShade="BF"/>
+    </w:rPr>
+  </w:style>
+  <w:style w:type="character" w:customStyle="1" w:styleId="Cabealho5Carcter">
+    <w:name w:val="Cabeçalho 5 Carácter"/>
+    <w:basedOn w:val="Tipodeletrapredefinidodopargrafo"/>
+    <w:link w:val="Cabealho5"/>
+    <w:uiPriority w:val="9"/>
+    <w:semiHidden/>
+    <w:rsid w:val="00681F58"/>
+    <w:rPr>
+      <w:rFonts w:eastAsiaTheme="majorEastAsia" w:cstheme="majorBidi"/>
+      <w:color w:val="0F4761" w:themeColor="accent1" w:themeShade="BF"/>
+    </w:rPr>
+  </w:style>
+  <w:style w:type="character" w:customStyle="1" w:styleId="Cabealho6Carcter">
+    <w:name w:val="Cabeçalho 6 Carácter"/>
+    <w:basedOn w:val="Tipodeletrapredefinidodopargrafo"/>
+    <w:link w:val="Cabealho6"/>
+    <w:uiPriority w:val="9"/>
+    <w:semiHidden/>
+    <w:rsid w:val="00681F58"/>
+    <w:rPr>
+      <w:rFonts w:eastAsiaTheme="majorEastAsia" w:cstheme="majorBidi"/>
+      <w:i/>
+      <w:iCs/>
+      <w:color w:val="595959" w:themeColor="text1" w:themeTint="A6"/>
+    </w:rPr>
+  </w:style>
+  <w:style w:type="character" w:customStyle="1" w:styleId="Cabealho7Carcter">
+    <w:name w:val="Cabeçalho 7 Carácter"/>
+    <w:basedOn w:val="Tipodeletrapredefinidodopargrafo"/>
+    <w:link w:val="Cabealho7"/>
+    <w:uiPriority w:val="9"/>
+    <w:semiHidden/>
+    <w:rsid w:val="00681F58"/>
+    <w:rPr>
+      <w:rFonts w:eastAsiaTheme="majorEastAsia" w:cstheme="majorBidi"/>
+      <w:color w:val="595959" w:themeColor="text1" w:themeTint="A6"/>
+    </w:rPr>
+  </w:style>
+  <w:style w:type="character" w:customStyle="1" w:styleId="Cabealho8Carcter">
+    <w:name w:val="Cabeçalho 8 Carácter"/>
+    <w:basedOn w:val="Tipodeletrapredefinidodopargrafo"/>
+    <w:link w:val="Cabealho8"/>
+    <w:uiPriority w:val="9"/>
+    <w:semiHidden/>
+    <w:rsid w:val="00681F58"/>
+    <w:rPr>
+      <w:rFonts w:eastAsiaTheme="majorEastAsia" w:cstheme="majorBidi"/>
+      <w:i/>
+      <w:iCs/>
+      <w:color w:val="272727" w:themeColor="text1" w:themeTint="D8"/>
+    </w:rPr>
+  </w:style>
+  <w:style w:type="character" w:customStyle="1" w:styleId="Cabealho9Carcter">
+    <w:name w:val="Cabeçalho 9 Carácter"/>
+    <w:basedOn w:val="Tipodeletrapredefinidodopargrafo"/>
+    <w:link w:val="Cabealho9"/>
+    <w:uiPriority w:val="9"/>
+    <w:semiHidden/>
+    <w:rsid w:val="00681F58"/>
+    <w:rPr>
+      <w:rFonts w:eastAsiaTheme="majorEastAsia" w:cstheme="majorBidi"/>
+      <w:color w:val="272727" w:themeColor="text1" w:themeTint="D8"/>
+    </w:rPr>
+  </w:style>
+  <w:style w:type="paragraph" w:styleId="Ttulo">
+    <w:name w:val="Title"/>
+    <w:basedOn w:val="Normal"/>
+    <w:next w:val="Normal"/>
+    <w:link w:val="TtuloCarcter"/>
+    <w:uiPriority w:val="10"/>
+    <w:qFormat/>
+    <w:rsid w:val="00681F58"/>
+    <w:pPr>
+      <w:spacing w:after="80" w:line="240" w:lineRule="auto"/>
+      <w:contextualSpacing/>
+    </w:pPr>
+    <w:rPr>
+      <w:rFonts w:asciiTheme="majorHAnsi" w:eastAsiaTheme="majorEastAsia" w:hAnsiTheme="majorHAnsi" w:cstheme="majorBidi"/>
+      <w:spacing w:val="-10"/>
+      <w:kern w:val="28"/>
+      <w:sz w:val="56"/>
+      <w:szCs w:val="56"/>
+    </w:rPr>
+  </w:style>
+  <w:style w:type="character" w:customStyle="1" w:styleId="TtuloCarcter">
+    <w:name w:val="Título Carácter"/>
+    <w:basedOn w:val="Tipodeletrapredefinidodopargrafo"/>
+    <w:link w:val="Ttulo"/>
+    <w:uiPriority w:val="10"/>
+    <w:rsid w:val="00681F58"/>
+    <w:rPr>
+      <w:rFonts w:asciiTheme="majorHAnsi" w:eastAsiaTheme="majorEastAsia" w:hAnsiTheme="majorHAnsi" w:cstheme="majorBidi"/>
+      <w:spacing w:val="-10"/>
+      <w:kern w:val="28"/>
+      <w:sz w:val="56"/>
+      <w:szCs w:val="56"/>
+    </w:rPr>
+  </w:style>
+  <w:style w:type="paragraph" w:styleId="Subttulo">
+    <w:name w:val="Subtitle"/>
+    <w:basedOn w:val="Normal"/>
+    <w:next w:val="Normal"/>
+    <w:link w:val="SubttuloCarcter"/>
+    <w:uiPriority w:val="11"/>
+    <w:qFormat/>
+    <w:rsid w:val="00681F58"/>
+    <w:pPr>
+      <w:numPr>
+        <w:ilvl w:val="1"/>
+      </w:numPr>
+    </w:pPr>
+    <w:rPr>
+      <w:rFonts w:eastAsiaTheme="majorEastAsia" w:cstheme="majorBidi"/>
+      <w:color w:val="595959" w:themeColor="text1" w:themeTint="A6"/>
+      <w:spacing w:val="15"/>
+      <w:sz w:val="28"/>
+      <w:szCs w:val="28"/>
+    </w:rPr>
+  </w:style>
+  <w:style w:type="character" w:customStyle="1" w:styleId="SubttuloCarcter">
+    <w:name w:val="Subtítulo Carácter"/>
+    <w:basedOn w:val="Tipodeletrapredefinidodopargrafo"/>
+    <w:link w:val="Subttulo"/>
+    <w:uiPriority w:val="11"/>
+    <w:rsid w:val="00681F58"/>
+    <w:rPr>
+      <w:rFonts w:eastAsiaTheme="majorEastAsia" w:cstheme="majorBidi"/>
+      <w:color w:val="595959" w:themeColor="text1" w:themeTint="A6"/>
+      <w:spacing w:val="15"/>
+      <w:sz w:val="28"/>
+      <w:szCs w:val="28"/>
+    </w:rPr>
+  </w:style>
+  <w:style w:type="paragraph" w:styleId="Citao">
+    <w:name w:val="Quote"/>
+    <w:basedOn w:val="Normal"/>
+    <w:next w:val="Normal"/>
+    <w:link w:val="CitaoCarcter"/>
+    <w:uiPriority w:val="29"/>
+    <w:qFormat/>
+    <w:rsid w:val="00681F58"/>
+    <w:pPr>
+      <w:spacing w:before="160"/>
+      <w:jc w:val="center"/>
+    </w:pPr>
+    <w:rPr>
+      <w:i/>
+      <w:iCs/>
+      <w:color w:val="404040" w:themeColor="text1" w:themeTint="BF"/>
+    </w:rPr>
+  </w:style>
+  <w:style w:type="character" w:customStyle="1" w:styleId="CitaoCarcter">
+    <w:name w:val="Citação Carácter"/>
+    <w:basedOn w:val="Tipodeletrapredefinidodopargrafo"/>
+    <w:link w:val="Citao"/>
+    <w:uiPriority w:val="29"/>
+    <w:rsid w:val="00681F58"/>
+    <w:rPr>
+      <w:i/>
+      <w:iCs/>
+      <w:color w:val="404040" w:themeColor="text1" w:themeTint="BF"/>
+    </w:rPr>
+  </w:style>
+  <w:style w:type="paragraph" w:styleId="PargrafodaLista">
+    <w:name w:val="List Paragraph"/>
+    <w:basedOn w:val="Normal"/>
+    <w:uiPriority w:val="34"/>
+    <w:qFormat/>
+    <w:rsid w:val="00681F58"/>
+    <w:pPr>
+      <w:ind w:left="720"/>
+      <w:contextualSpacing/>
+    </w:pPr>
+  </w:style>
+  <w:style w:type="character" w:styleId="nfaseIntenso">
+    <w:name w:val="Intense Emphasis"/>
+    <w:basedOn w:val="Tipodeletrapredefinidodopargrafo"/>
+    <w:uiPriority w:val="21"/>
+    <w:qFormat/>
+    <w:rsid w:val="00681F58"/>
+    <w:rPr>
+      <w:i/>
+      <w:iCs/>
+      <w:color w:val="0F4761" w:themeColor="accent1" w:themeShade="BF"/>
+    </w:rPr>
+  </w:style>
+  <w:style w:type="paragraph" w:styleId="CitaoIntensa">
+    <w:name w:val="Intense Quote"/>
+    <w:basedOn w:val="Normal"/>
+    <w:next w:val="Normal"/>
+    <w:link w:val="CitaoIntensaCarcter"/>
+    <w:uiPriority w:val="30"/>
+    <w:qFormat/>
+    <w:rsid w:val="00681F58"/>
+    <w:pPr>
+      <w:pBdr>
+        <w:top w:val="single" w:sz="4" w:space="10" w:color="0F4761" w:themeColor="accent1" w:themeShade="BF"/>
+        <w:bottom w:val="single" w:sz="4" w:space="10" w:color="0F4761" w:themeColor="accent1" w:themeShade="BF"/>
+      </w:pBdr>
+      <w:spacing w:before="360" w:after="360"/>
+      <w:ind w:left="864" w:right="864"/>
+      <w:jc w:val="center"/>
+    </w:pPr>
+    <w:rPr>
+      <w:i/>
+      <w:iCs/>
+      <w:color w:val="0F4761" w:themeColor="accent1" w:themeShade="BF"/>
+    </w:rPr>
+  </w:style>
+  <w:style w:type="character" w:customStyle="1" w:styleId="CitaoIntensaCarcter">
+    <w:name w:val="Citação Intensa Carácter"/>
+    <w:basedOn w:val="Tipodeletrapredefinidodopargrafo"/>
+    <w:link w:val="CitaoIntensa"/>
+    <w:uiPriority w:val="30"/>
+    <w:rsid w:val="00681F58"/>
+    <w:rPr>
+      <w:i/>
+      <w:iCs/>
+      <w:color w:val="0F4761" w:themeColor="accent1" w:themeShade="BF"/>
+    </w:rPr>
+  </w:style>
+  <w:style w:type="character" w:styleId="RefernciaIntensa">
+    <w:name w:val="Intense Reference"/>
+    <w:basedOn w:val="Tipodeletrapredefinidodopargrafo"/>
+    <w:uiPriority w:val="32"/>
+    <w:qFormat/>
+    <w:rsid w:val="00681F58"/>
+    <w:rPr>
+      <w:b/>
+      <w:bCs/>
+      <w:smallCaps/>
+      <w:color w:val="0F4761" w:themeColor="accent1" w:themeShade="BF"/>
+      <w:spacing w:val="5"/>
+    </w:rPr>
+  </w:style>
+  <w:style w:type="character" w:styleId="Hiperligao">
+    <w:name w:val="Hyperlink"/>
+    <w:basedOn w:val="Tipodeletrapredefinidodopargrafo"/>
+    <w:uiPriority w:val="99"/>
+    <w:unhideWhenUsed/>
+    <w:rsid w:val="00681F58"/>
+    <w:rPr>
+      <w:color w:val="467886" w:themeColor="hyperlink"/>
+      <w:u w:val="single"/>
+    </w:rPr>
+  </w:style>
+  <w:style w:type="character" w:customStyle="1" w:styleId="UnresolvedMention">
+    <w:name w:val="Unresolved Mention"/>
+    <w:basedOn w:val="Tipodeletrapredefinidodopargrafo"/>
+    <w:uiPriority w:val="99"/>
+    <w:semiHidden/>
+    <w:unhideWhenUsed/>
+    <w:rsid w:val="00681F58"/>
+    <w:rPr>
+      <w:color w:val="605E5C"/>
+      <w:shd w:val="clear" w:color="auto" w:fill="E1DFDD"/>
+    </w:rPr>
+  </w:style>
+  <w:style w:type="paragraph" w:styleId="Ttulodondice">
+    <w:name w:val="TOC Heading"/>
+    <w:basedOn w:val="Cabealho1"/>
+    <w:next w:val="Normal"/>
+    <w:uiPriority w:val="39"/>
+    <w:unhideWhenUsed/>
+    <w:qFormat/>
+    <w:rsid w:val="00BD2E4E"/>
+    <w:pPr>
+      <w:spacing w:before="240" w:after="0"/>
+      <w:outlineLvl w:val="9"/>
+    </w:pPr>
+    <w:rPr>
+      <w:kern w:val="0"/>
+      <w:sz w:val="32"/>
+      <w:szCs w:val="32"/>
+      <w:lang w:eastAsia="pt-BR"/>
+      <w14:ligatures w14:val="none"/>
+    </w:rPr>
+  </w:style>
+  <w:style w:type="paragraph" w:styleId="ndice2">
+    <w:name w:val="toc 2"/>
+    <w:basedOn w:val="Normal"/>
+    <w:next w:val="Normal"/>
+    <w:autoRedefine/>
+    <w:uiPriority w:val="39"/>
+    <w:unhideWhenUsed/>
+    <w:rsid w:val="00BD2E4E"/>
+    <w:pPr>
+      <w:spacing w:after="100"/>
+      <w:ind w:left="220"/>
+    </w:pPr>
+    <w:rPr>
+      <w:rFonts w:eastAsiaTheme="minorEastAsia" w:cs="Times New Roman"/>
+      <w:kern w:val="0"/>
+      <w:lang w:eastAsia="pt-BR"/>
+      <w14:ligatures w14:val="none"/>
+    </w:rPr>
+  </w:style>
+  <w:style w:type="paragraph" w:styleId="ndice1">
+    <w:name w:val="toc 1"/>
+    <w:basedOn w:val="Normal"/>
+    <w:next w:val="Normal"/>
+    <w:autoRedefine/>
+    <w:uiPriority w:val="39"/>
+    <w:unhideWhenUsed/>
+    <w:rsid w:val="00BD2E4E"/>
+    <w:pPr>
+      <w:spacing w:after="100"/>
+    </w:pPr>
+    <w:rPr>
+      <w:rFonts w:eastAsiaTheme="minorEastAsia" w:cs="Times New Roman"/>
+      <w:kern w:val="0"/>
+      <w:lang w:eastAsia="pt-BR"/>
+      <w14:ligatures w14:val="none"/>
+    </w:rPr>
+  </w:style>
+  <w:style w:type="paragraph" w:styleId="ndice3">
+    <w:name w:val="toc 3"/>
+    <w:basedOn w:val="Normal"/>
+    <w:next w:val="Normal"/>
+    <w:autoRedefine/>
+    <w:uiPriority w:val="39"/>
+    <w:unhideWhenUsed/>
+    <w:rsid w:val="00BD2E4E"/>
+    <w:pPr>
+      <w:spacing w:after="100"/>
+      <w:ind w:left="440"/>
+    </w:pPr>
+    <w:rPr>
+      <w:rFonts w:eastAsiaTheme="minorEastAsia" w:cs="Times New Roman"/>
+      <w:kern w:val="0"/>
+      <w:lang w:eastAsia="pt-BR"/>
+      <w14:ligatures w14:val="none"/>
+    </w:rPr>
+  </w:style>
+  <w:style w:type="paragraph" w:styleId="Textodebalo">
+    <w:name w:val="Balloon Text"/>
+    <w:basedOn w:val="Normal"/>
+    <w:link w:val="TextodebaloCarcter"/>
+    <w:uiPriority w:val="99"/>
+    <w:semiHidden/>
+    <w:unhideWhenUsed/>
+    <w:rsid w:val="006521EA"/>
+    <w:pPr>
+      <w:spacing w:after="0" w:line="240" w:lineRule="auto"/>
+    </w:pPr>
+    <w:rPr>
+      <w:rFonts w:ascii="Tahoma" w:hAnsi="Tahoma" w:cs="Tahoma"/>
+      <w:sz w:val="16"/>
+      <w:szCs w:val="16"/>
+    </w:rPr>
+  </w:style>
+  <w:style w:type="character" w:customStyle="1" w:styleId="TextodebaloCarcter">
+    <w:name w:val="Texto de balão Carácter"/>
+    <w:basedOn w:val="Tipodeletrapredefinidodopargrafo"/>
+    <w:link w:val="Textodebalo"/>
+    <w:uiPriority w:val="99"/>
+    <w:semiHidden/>
+    <w:rsid w:val="006521EA"/>
+    <w:rPr>
+      <w:rFonts w:ascii="Tahoma" w:hAnsi="Tahoma" w:cs="Tahoma"/>
+      <w:sz w:val="16"/>
+      <w:szCs w:val="16"/>
     </w:rPr>
   </w:style>
 </w:styles>
@@ -3356,7 +3851,7 @@
   <a:extraClrSchemeLst/>
   <a:extLst>
     <a:ext uri="{05A4C25C-085E-4340-85A3-A5531E510DB2}">
-      <thm15:themeFamily xmlns:thm15="http://schemas.microsoft.com/office/thememl/2012/main" name="Office Theme" id="{62F939B6-93AF-4DB8-9C6B-D6C7DFDC589F}" vid="{4A3C46E8-61CC-4603-A589-7422A47A8E4A}"/>
+      <thm15:themeFamily xmlns:thm15="http://schemas.microsoft.com/office/thememl/2012/main" xmlns="" name="Office Theme" id="{62F939B6-93AF-4DB8-9C6B-D6C7DFDC589F}" vid="{4A3C46E8-61CC-4603-A589-7422A47A8E4A}"/>
     </a:ext>
   </a:extLst>
 </a:theme>
@@ -3367,7 +3862,7 @@
 </file>
 
 <file path=customXml/itemProps1.xml><?xml version="1.0" encoding="utf-8"?>
-<ds:datastoreItem xmlns:ds="http://schemas.openxmlformats.org/officeDocument/2006/customXml" ds:itemID="{292F06F9-6D51-40A7-833B-02192D884ED6}">
+<ds:datastoreItem xmlns:ds="http://schemas.openxmlformats.org/officeDocument/2006/customXml" ds:itemID="{BF64EA6A-A8EB-4F6A-A436-FE7F95304698}">
   <ds:schemaRefs>
     <ds:schemaRef ds:uri="http://schemas.openxmlformats.org/officeDocument/2006/bibliography"/>
   </ds:schemaRefs>

</xml_diff>